<commit_message>
nba anova intro updated
</commit_message>
<xml_diff>
--- a/basketball/nba_draft_anova_intro/nba_draft_worksheet_word.docx
+++ b/basketball/nba_draft_anova_intro/nba_draft_worksheet_word.docx
@@ -1,6 +1,6 @@
 
 <file path=word/document.xml><?xml version="1.0" encoding="utf-8"?>
-<w:document xmlns:wpc="http://schemas.microsoft.com/office/word/2010/wordprocessingCanvas" xmlns:cx="http://schemas.microsoft.com/office/drawing/2014/chartex" xmlns:cx1="http://schemas.microsoft.com/office/drawing/2015/9/8/chartex" xmlns:cx2="http://schemas.microsoft.com/office/drawing/2015/10/21/chartex" xmlns:cx3="http://schemas.microsoft.com/office/drawing/2016/5/9/chartex" xmlns:cx4="http://schemas.microsoft.com/office/drawing/2016/5/10/chartex" xmlns:cx5="http://schemas.microsoft.com/office/drawing/2016/5/11/chartex" xmlns:cx6="http://schemas.microsoft.com/office/drawing/2016/5/12/chartex" xmlns:cx7="http://schemas.microsoft.com/office/drawing/2016/5/13/chartex" xmlns:cx8="http://schemas.microsoft.com/office/drawing/2016/5/14/chartex" xmlns:mc="http://schemas.openxmlformats.org/markup-compatibility/2006" xmlns:aink="http://schemas.microsoft.com/office/drawing/2016/ink" xmlns:am3d="http://schemas.microsoft.com/office/drawing/2017/model3d" xmlns:o="urn:schemas-microsoft-com:office:office" xmlns:oel="http://schemas.microsoft.com/office/2019/extlst" xmlns:r="http://schemas.openxmlformats.org/officeDocument/2006/relationships" xmlns:m="http://schemas.openxmlformats.org/officeDocument/2006/math" xmlns:v="urn:schemas-microsoft-com:vml" xmlns:wp14="http://schemas.microsoft.com/office/word/2010/wordprocessingDrawing" xmlns:wp="http://schemas.openxmlformats.org/drawingml/2006/wordprocessingDrawing" xmlns:w10="urn:schemas-microsoft-com:office:word" xmlns:w="http://schemas.openxmlformats.org/wordprocessingml/2006/main" xmlns:w14="http://schemas.microsoft.com/office/word/2010/wordml" xmlns:w15="http://schemas.microsoft.com/office/word/2012/wordml" xmlns:w16cex="http://schemas.microsoft.com/office/word/2018/wordml/cex" xmlns:w16cid="http://schemas.microsoft.com/office/word/2016/wordml/cid" xmlns:w16="http://schemas.microsoft.com/office/word/2018/wordml" xmlns:w16sdtdh="http://schemas.microsoft.com/office/word/2020/wordml/sdtdatahash" xmlns:w16se="http://schemas.microsoft.com/office/word/2015/wordml/symex" xmlns:wpg="http://schemas.microsoft.com/office/word/2010/wordprocessingGroup" xmlns:wpi="http://schemas.microsoft.com/office/word/2010/wordprocessingInk" xmlns:wne="http://schemas.microsoft.com/office/word/2006/wordml" xmlns:wps="http://schemas.microsoft.com/office/word/2010/wordprocessingShape" mc:Ignorable="w14 w15 w16se w16cid w16 w16cex w16sdtdh wp14">
+<w:document xmlns:wpc="http://schemas.microsoft.com/office/word/2010/wordprocessingCanvas" xmlns:cx="http://schemas.microsoft.com/office/drawing/2014/chartex" xmlns:cx1="http://schemas.microsoft.com/office/drawing/2015/9/8/chartex" xmlns:mc="http://schemas.openxmlformats.org/markup-compatibility/2006" xmlns:o="urn:schemas-microsoft-com:office:office" xmlns:r="http://schemas.openxmlformats.org/officeDocument/2006/relationships" xmlns:m="http://schemas.openxmlformats.org/officeDocument/2006/math" xmlns:v="urn:schemas-microsoft-com:vml" xmlns:wp14="http://schemas.microsoft.com/office/word/2010/wordprocessingDrawing" xmlns:wp="http://schemas.openxmlformats.org/drawingml/2006/wordprocessingDrawing" xmlns:w10="urn:schemas-microsoft-com:office:word" xmlns:w="http://schemas.openxmlformats.org/wordprocessingml/2006/main" xmlns:w14="http://schemas.microsoft.com/office/word/2010/wordml" xmlns:w15="http://schemas.microsoft.com/office/word/2012/wordml" xmlns:w16se="http://schemas.microsoft.com/office/word/2015/wordml/symex" xmlns:wpg="http://schemas.microsoft.com/office/word/2010/wordprocessingGroup" xmlns:wpi="http://schemas.microsoft.com/office/word/2010/wordprocessingInk" xmlns:wne="http://schemas.microsoft.com/office/word/2006/wordml" xmlns:wps="http://schemas.microsoft.com/office/word/2010/wordprocessingShape" mc:Ignorable="w14 w15 w16se wp14">
   <w:body>
     <w:p>
       <w:pPr>
@@ -79,6 +79,11 @@
         <w:t>The draft is comprised of 60 players and takes place over two rounds of 30 selections. Teams pick players in an order based on performance from the previous season, with teams that performed poorly getting earlier picks in order to create a seemingly more level playing field.</w:t>
       </w:r>
       <w:r>
+        <w:rPr>
+          <w:rFonts w:asciiTheme="minorHAnsi" w:hAnsiTheme="minorHAnsi" w:cstheme="minorHAnsi"/>
+          <w:sz w:val="20"/>
+          <w:szCs w:val="20"/>
+        </w:rPr>
         <w:t xml:space="preserve"> </w:t>
       </w:r>
       <w:r>
@@ -117,20 +122,11 @@
           <w:sz w:val="20"/>
           <w:szCs w:val="20"/>
         </w:rPr>
-        <w:t xml:space="preserve">The data you’ll be using </w:t>
-      </w:r>
-      <w:r>
-        <w:rPr>
-          <w:rFonts w:asciiTheme="minorHAnsi" w:hAnsiTheme="minorHAnsi" w:cstheme="minorHAnsi"/>
-          <w:color w:val="000000" w:themeColor="text1"/>
-          <w:sz w:val="20"/>
-          <w:szCs w:val="20"/>
-        </w:rPr>
-        <w:t xml:space="preserve">comes from the dataset </w:t>
-      </w:r>
-      <w:r>
-        <w:rPr>
-          <w:rFonts w:ascii="Courier New" w:hAnsi="Courier New" w:cs="Courier New"/>
+        <w:t xml:space="preserve">The data you’ll be using comes from the dataset </w:t>
+      </w:r>
+      <w:r>
+        <w:rPr>
+          <w:rFonts w:asciiTheme="minorHAnsi" w:hAnsiTheme="minorHAnsi" w:cstheme="minorHAnsi"/>
           <w:b/>
           <w:bCs/>
           <w:color w:val="000000" w:themeColor="text1"/>
@@ -141,36 +137,65 @@
       </w:r>
       <w:r>
         <w:rPr>
-          <w:rFonts w:ascii="Courier New" w:hAnsi="Courier New" w:cs="Courier New"/>
-          <w:color w:val="000000" w:themeColor="text1"/>
-          <w:sz w:val="20"/>
-          <w:szCs w:val="20"/>
-        </w:rPr>
-        <w:t xml:space="preserve"> </w:t>
-      </w:r>
-      <w:r>
-        <w:rPr>
-          <w:rFonts w:asciiTheme="minorHAnsi" w:hAnsiTheme="minorHAnsi" w:cstheme="minorHAnsi"/>
-          <w:color w:val="000000" w:themeColor="text1"/>
-          <w:sz w:val="20"/>
-          <w:szCs w:val="20"/>
-        </w:rPr>
-        <w:t xml:space="preserve">and </w:t>
-      </w:r>
-      <w:r>
-        <w:rPr>
-          <w:rFonts w:asciiTheme="minorHAnsi" w:hAnsiTheme="minorHAnsi" w:cstheme="minorHAnsi"/>
-          <w:color w:val="000000" w:themeColor="text1"/>
-          <w:sz w:val="20"/>
-          <w:szCs w:val="20"/>
-        </w:rPr>
-        <w:t xml:space="preserve">focuses on players that were selected in the first round of the NBA draft between the years 1990-2021, and they are divided based on what number in the first round they were selected (1-10, 11-20, or 21-30). For each player, there are a range of different statistics from their careers in the NBA, some of which are ongoing, we will be focusing on the average number of minutes played per game. </w:t>
-      </w:r>
-    </w:p>
-    <w:p>
-      <w:pPr>
-        <w:rPr>
-          <w:rFonts w:asciiTheme="majorHAnsi" w:hAnsiTheme="majorHAnsi" w:cstheme="majorHAnsi"/>
+          <w:rFonts w:asciiTheme="minorHAnsi" w:hAnsiTheme="minorHAnsi" w:cstheme="minorHAnsi"/>
+          <w:color w:val="000000" w:themeColor="text1"/>
+          <w:sz w:val="20"/>
+          <w:szCs w:val="20"/>
+        </w:rPr>
+        <w:t xml:space="preserve"> and </w:t>
+      </w:r>
+      <w:r>
+        <w:rPr>
+          <w:rFonts w:asciiTheme="minorHAnsi" w:hAnsiTheme="minorHAnsi" w:cstheme="minorHAnsi"/>
+          <w:color w:val="000000" w:themeColor="text1"/>
+          <w:sz w:val="20"/>
+          <w:szCs w:val="20"/>
+        </w:rPr>
+        <w:t xml:space="preserve">focuses on players that were selected in the first round of the NBA draft between the years 1990-2021. </w:t>
+      </w:r>
+      <w:r>
+        <w:rPr>
+          <w:rFonts w:asciiTheme="minorHAnsi" w:hAnsiTheme="minorHAnsi" w:cstheme="minorHAnsi"/>
+          <w:color w:val="000000" w:themeColor="text1"/>
+          <w:sz w:val="20"/>
+          <w:szCs w:val="20"/>
+        </w:rPr>
+        <w:t>For each player, the dataset includes a range of career statistics from their time in the NBA. Some players’ careers are still ongoing, but in this activity we will focus on the average number of minutes they have played per game.</w:t>
+      </w:r>
+    </w:p>
+    <w:p>
+      <w:pPr>
+        <w:rPr>
+          <w:rFonts w:asciiTheme="minorHAnsi" w:hAnsiTheme="minorHAnsi" w:cstheme="minorHAnsi"/>
+          <w:color w:val="000000" w:themeColor="text1"/>
+          <w:sz w:val="20"/>
+          <w:szCs w:val="20"/>
+        </w:rPr>
+      </w:pPr>
+    </w:p>
+    <w:p>
+      <w:pPr>
+        <w:rPr>
+          <w:rFonts w:asciiTheme="minorHAnsi" w:hAnsiTheme="minorHAnsi" w:cstheme="minorHAnsi"/>
+          <w:color w:val="000000" w:themeColor="text1"/>
+          <w:sz w:val="20"/>
+          <w:szCs w:val="20"/>
+        </w:rPr>
+      </w:pPr>
+      <w:r>
+        <w:rPr>
+          <w:rFonts w:asciiTheme="minorHAnsi" w:hAnsiTheme="minorHAnsi" w:cstheme="minorHAnsi"/>
+          <w:color w:val="000000" w:themeColor="text1"/>
+          <w:sz w:val="20"/>
+          <w:szCs w:val="20"/>
+        </w:rPr>
+        <w:t>Analyzing minutes per game is useful because it measures how much playing time a player earned during their NBA career, which is one indicator of a player’s role and value to a team. However, minutes per game is not a perfect measure of player quality because playing time can also be influenced by team expectations, injuries, roster needs, coaching decisions, and the opportunity given to high draft picks.</w:t>
+      </w:r>
+    </w:p>
+    <w:p>
+      <w:pPr>
+        <w:rPr>
+          <w:rFonts w:asciiTheme="minorHAnsi" w:hAnsiTheme="minorHAnsi" w:cstheme="minorHAnsi"/>
           <w:b/>
           <w:bCs/>
           <w:color w:val="000000" w:themeColor="text1"/>
@@ -183,38 +208,183 @@
       <w:pPr>
         <w:rPr>
           <w:rFonts w:asciiTheme="minorHAnsi" w:hAnsiTheme="minorHAnsi" w:cstheme="minorHAnsi"/>
-          <w:color w:val="000000" w:themeColor="text1"/>
-          <w:sz w:val="20"/>
-          <w:szCs w:val="20"/>
-        </w:rPr>
-      </w:pPr>
-      <w:r>
-        <w:rPr>
-          <w:rFonts w:asciiTheme="minorHAnsi" w:hAnsiTheme="minorHAnsi" w:cstheme="minorHAnsi"/>
-          <w:color w:val="000000" w:themeColor="text1"/>
-          <w:sz w:val="20"/>
-          <w:szCs w:val="20"/>
-        </w:rPr>
-        <w:t>The graphs below show a density plot corresponding to the minutes per game based on players who were selected in Round 1 of the NBA draft. The dashed line represents the groups mean. The box plots represent the variance for the minutes played for players who were selected in the first round.</w:t>
-      </w:r>
-    </w:p>
-    <w:p>
-      <w:pPr>
-        <w:rPr>
-          <w:rFonts w:asciiTheme="minorHAnsi" w:hAnsiTheme="minorHAnsi" w:cstheme="minorHAnsi"/>
-          <w:color w:val="000000" w:themeColor="text1"/>
-          <w:sz w:val="20"/>
-          <w:szCs w:val="20"/>
-        </w:rPr>
-      </w:pPr>
-      <w:r>
-        <w:rPr>
-          <w:rFonts w:asciiTheme="minorHAnsi" w:hAnsiTheme="minorHAnsi" w:cstheme="minorHAnsi"/>
-          <w:color w:val="000000" w:themeColor="text1"/>
-          <w:sz w:val="20"/>
-          <w:szCs w:val="20"/>
-        </w:rPr>
-        <w:t xml:space="preserve"> </w:t>
+          <w:bCs/>
+          <w:color w:val="000000" w:themeColor="text1"/>
+          <w:sz w:val="20"/>
+          <w:szCs w:val="20"/>
+        </w:rPr>
+      </w:pPr>
+      <w:r>
+        <w:rPr>
+          <w:rFonts w:asciiTheme="minorHAnsi" w:hAnsiTheme="minorHAnsi" w:cstheme="minorHAnsi"/>
+          <w:bCs/>
+          <w:color w:val="000000" w:themeColor="text1"/>
+          <w:sz w:val="20"/>
+          <w:szCs w:val="20"/>
+        </w:rPr>
+        <w:t>In this activity, we will investigate whether NBA players selected earlier in the first round tend to have different average career minutes per game than players selected later in the first round. To do this, we will compare three groups of first-round picks: picks 1</w:t>
+      </w:r>
+      <w:r>
+        <w:rPr>
+          <w:rFonts w:asciiTheme="minorHAnsi" w:hAnsiTheme="minorHAnsi" w:cstheme="minorHAnsi"/>
+          <w:bCs/>
+          <w:color w:val="000000" w:themeColor="text1"/>
+          <w:sz w:val="20"/>
+          <w:szCs w:val="20"/>
+        </w:rPr>
+        <w:t>-</w:t>
+      </w:r>
+      <w:r>
+        <w:rPr>
+          <w:rFonts w:asciiTheme="minorHAnsi" w:hAnsiTheme="minorHAnsi" w:cstheme="minorHAnsi"/>
+          <w:bCs/>
+          <w:color w:val="000000" w:themeColor="text1"/>
+          <w:sz w:val="20"/>
+          <w:szCs w:val="20"/>
+        </w:rPr>
+        <w:t>10, picks 11</w:t>
+      </w:r>
+      <w:r>
+        <w:rPr>
+          <w:rFonts w:asciiTheme="minorHAnsi" w:hAnsiTheme="minorHAnsi" w:cstheme="minorHAnsi"/>
+          <w:bCs/>
+          <w:color w:val="000000" w:themeColor="text1"/>
+          <w:sz w:val="20"/>
+          <w:szCs w:val="20"/>
+        </w:rPr>
+        <w:t>-</w:t>
+      </w:r>
+      <w:r>
+        <w:rPr>
+          <w:rFonts w:asciiTheme="minorHAnsi" w:hAnsiTheme="minorHAnsi" w:cstheme="minorHAnsi"/>
+          <w:bCs/>
+          <w:color w:val="000000" w:themeColor="text1"/>
+          <w:sz w:val="20"/>
+          <w:szCs w:val="20"/>
+        </w:rPr>
+        <w:t>20, and picks 21</w:t>
+      </w:r>
+      <w:r>
+        <w:rPr>
+          <w:rFonts w:asciiTheme="minorHAnsi" w:hAnsiTheme="minorHAnsi" w:cstheme="minorHAnsi"/>
+          <w:bCs/>
+          <w:color w:val="000000" w:themeColor="text1"/>
+          <w:sz w:val="20"/>
+          <w:szCs w:val="20"/>
+        </w:rPr>
+        <w:t>-</w:t>
+      </w:r>
+      <w:r>
+        <w:rPr>
+          <w:rFonts w:asciiTheme="minorHAnsi" w:hAnsiTheme="minorHAnsi" w:cstheme="minorHAnsi"/>
+          <w:bCs/>
+          <w:color w:val="000000" w:themeColor="text1"/>
+          <w:sz w:val="20"/>
+          <w:szCs w:val="20"/>
+        </w:rPr>
+        <w:t>30.</w:t>
+      </w:r>
+    </w:p>
+    <w:p>
+      <w:pPr>
+        <w:rPr>
+          <w:rFonts w:asciiTheme="minorHAnsi" w:hAnsiTheme="minorHAnsi" w:cstheme="minorHAnsi"/>
+          <w:bCs/>
+          <w:color w:val="000000" w:themeColor="text1"/>
+          <w:sz w:val="20"/>
+          <w:szCs w:val="20"/>
+        </w:rPr>
+      </w:pPr>
+    </w:p>
+    <w:p>
+      <w:pPr>
+        <w:rPr>
+          <w:rFonts w:asciiTheme="minorHAnsi" w:hAnsiTheme="minorHAnsi" w:cstheme="minorHAnsi"/>
+          <w:color w:val="000000" w:themeColor="text1"/>
+          <w:sz w:val="20"/>
+          <w:szCs w:val="20"/>
+        </w:rPr>
+      </w:pPr>
+      <w:r>
+        <w:rPr>
+          <w:rFonts w:asciiTheme="minorHAnsi" w:hAnsiTheme="minorHAnsi" w:cstheme="minorHAnsi"/>
+          <w:color w:val="000000" w:themeColor="text1"/>
+          <w:sz w:val="20"/>
+          <w:szCs w:val="20"/>
+        </w:rPr>
+        <w:t>The graphs below summarize career minutes per game for players selected in the first round of the NBA Draft from 1990</w:t>
+      </w:r>
+      <w:r>
+        <w:rPr>
+          <w:rFonts w:asciiTheme="minorHAnsi" w:hAnsiTheme="minorHAnsi" w:cstheme="minorHAnsi"/>
+          <w:color w:val="000000" w:themeColor="text1"/>
+          <w:sz w:val="20"/>
+          <w:szCs w:val="20"/>
+        </w:rPr>
+        <w:t>-</w:t>
+      </w:r>
+      <w:r>
+        <w:rPr>
+          <w:rFonts w:asciiTheme="minorHAnsi" w:hAnsiTheme="minorHAnsi" w:cstheme="minorHAnsi"/>
+          <w:color w:val="000000" w:themeColor="text1"/>
+          <w:sz w:val="20"/>
+          <w:szCs w:val="20"/>
+        </w:rPr>
+        <w:t>2021. Players are grouped by where they were selected in the first round: picks 1</w:t>
+      </w:r>
+      <w:r>
+        <w:rPr>
+          <w:rFonts w:asciiTheme="minorHAnsi" w:hAnsiTheme="minorHAnsi" w:cstheme="minorHAnsi"/>
+          <w:color w:val="000000" w:themeColor="text1"/>
+          <w:sz w:val="20"/>
+          <w:szCs w:val="20"/>
+        </w:rPr>
+        <w:t>-</w:t>
+      </w:r>
+      <w:r>
+        <w:rPr>
+          <w:rFonts w:asciiTheme="minorHAnsi" w:hAnsiTheme="minorHAnsi" w:cstheme="minorHAnsi"/>
+          <w:color w:val="000000" w:themeColor="text1"/>
+          <w:sz w:val="20"/>
+          <w:szCs w:val="20"/>
+        </w:rPr>
+        <w:t>10, picks 11</w:t>
+      </w:r>
+      <w:r>
+        <w:rPr>
+          <w:rFonts w:asciiTheme="minorHAnsi" w:hAnsiTheme="minorHAnsi" w:cstheme="minorHAnsi"/>
+          <w:color w:val="000000" w:themeColor="text1"/>
+          <w:sz w:val="20"/>
+          <w:szCs w:val="20"/>
+        </w:rPr>
+        <w:t>-</w:t>
+      </w:r>
+      <w:r>
+        <w:rPr>
+          <w:rFonts w:asciiTheme="minorHAnsi" w:hAnsiTheme="minorHAnsi" w:cstheme="minorHAnsi"/>
+          <w:color w:val="000000" w:themeColor="text1"/>
+          <w:sz w:val="20"/>
+          <w:szCs w:val="20"/>
+        </w:rPr>
+        <w:t>20, and picks 21</w:t>
+      </w:r>
+      <w:r>
+        <w:rPr>
+          <w:rFonts w:asciiTheme="minorHAnsi" w:hAnsiTheme="minorHAnsi" w:cstheme="minorHAnsi"/>
+          <w:color w:val="000000" w:themeColor="text1"/>
+          <w:sz w:val="20"/>
+          <w:szCs w:val="20"/>
+        </w:rPr>
+        <w:t>-</w:t>
+      </w:r>
+      <w:r>
+        <w:rPr>
+          <w:rFonts w:asciiTheme="minorHAnsi" w:hAnsiTheme="minorHAnsi" w:cstheme="minorHAnsi"/>
+          <w:color w:val="000000" w:themeColor="text1"/>
+          <w:sz w:val="20"/>
+          <w:szCs w:val="20"/>
+        </w:rPr>
+        <w:t>30. The density plot shows the distribution of minutes per game for each group, with dashed vertical lines representing the group means. The side-by-side boxplots provide another way to compare the center, spread, and potential outliers in minutes per game across the three draft-pick groups.</w:t>
       </w:r>
     </w:p>
     <w:p>
@@ -235,7 +405,7 @@
           <w:szCs w:val="20"/>
         </w:rPr>
         <w:drawing>
-          <wp:anchor distT="0" distB="0" distL="114300" distR="114300" simplePos="0" relativeHeight="251659264" behindDoc="0" locked="0" layoutInCell="1" allowOverlap="1" wp14:anchorId="3B622F9F" wp14:editId="40C9AD32">
+          <wp:anchor distT="0" distB="0" distL="114300" distR="114300" simplePos="0" relativeHeight="251661312" behindDoc="0" locked="0" layoutInCell="1" allowOverlap="1" wp14:anchorId="1BE763BA" wp14:editId="63096FA5">
             <wp:simplePos x="0" y="0"/>
             <wp:positionH relativeFrom="column">
               <wp:posOffset>-181610</wp:posOffset>
@@ -299,7 +469,7 @@
           <w:szCs w:val="20"/>
         </w:rPr>
         <w:drawing>
-          <wp:anchor distT="0" distB="0" distL="114300" distR="114300" simplePos="0" relativeHeight="251660288" behindDoc="0" locked="0" layoutInCell="1" allowOverlap="1" wp14:anchorId="1406271E" wp14:editId="4B17561B">
+          <wp:anchor distT="0" distB="0" distL="114300" distR="114300" simplePos="0" relativeHeight="251662336" behindDoc="0" locked="0" layoutInCell="1" allowOverlap="1" wp14:anchorId="27636660" wp14:editId="681C9A4F">
             <wp:simplePos x="0" y="0"/>
             <wp:positionH relativeFrom="column">
               <wp:posOffset>3376930</wp:posOffset>
@@ -510,6 +680,50 @@
     <w:p>
       <w:pPr>
         <w:pStyle w:val="ListParagraph"/>
+        <w:numPr>
+          <w:ilvl w:val="0"/>
+          <w:numId w:val="1"/>
+        </w:numPr>
+        <w:rPr>
+          <w:rFonts w:asciiTheme="minorHAnsi" w:hAnsiTheme="minorHAnsi" w:cstheme="minorHAnsi"/>
+          <w:color w:val="000000" w:themeColor="text1"/>
+          <w:sz w:val="20"/>
+          <w:szCs w:val="20"/>
+        </w:rPr>
+      </w:pPr>
+      <w:r>
+        <w:rPr>
+          <w:rFonts w:asciiTheme="minorHAnsi" w:hAnsiTheme="minorHAnsi" w:cstheme="minorHAnsi"/>
+          <w:color w:val="000000" w:themeColor="text1"/>
+          <w:sz w:val="20"/>
+          <w:szCs w:val="20"/>
+        </w:rPr>
+        <w:t xml:space="preserve">Based on the density plot and side-by-side boxplots, what do you notice about the distributions of minutes per game for the three draft-pick groups? </w:t>
+      </w:r>
+      <w:r>
+        <w:rPr>
+          <w:rFonts w:asciiTheme="minorHAnsi" w:hAnsiTheme="minorHAnsi" w:cstheme="minorHAnsi"/>
+          <w:color w:val="000000" w:themeColor="text1"/>
+          <w:sz w:val="20"/>
+          <w:szCs w:val="20"/>
+        </w:rPr>
+        <w:t>What conclusions can you draw upon first glance of the two data visualizations? Are there any concerns?</w:t>
+      </w:r>
+    </w:p>
+    <w:p>
+      <w:pPr>
+        <w:pStyle w:val="ListParagraph"/>
+        <w:rPr>
+          <w:rFonts w:asciiTheme="minorHAnsi" w:hAnsiTheme="minorHAnsi" w:cstheme="minorHAnsi"/>
+          <w:color w:val="000000" w:themeColor="text1"/>
+          <w:sz w:val="20"/>
+          <w:szCs w:val="20"/>
+        </w:rPr>
+      </w:pPr>
+    </w:p>
+    <w:p>
+      <w:pPr>
+        <w:pStyle w:val="ListParagraph"/>
         <w:rPr>
           <w:rFonts w:asciiTheme="minorHAnsi" w:hAnsiTheme="minorHAnsi" w:cstheme="minorHAnsi"/>
           <w:color w:val="000000" w:themeColor="text1"/>
@@ -550,115 +764,13 @@
           <w:sz w:val="20"/>
           <w:szCs w:val="20"/>
         </w:rPr>
-        <w:t xml:space="preserve">Based on this density plot and the box plots above, </w:t>
-      </w:r>
-      <w:r>
-        <w:rPr>
-          <w:rFonts w:asciiTheme="minorHAnsi" w:hAnsiTheme="minorHAnsi" w:cstheme="minorHAnsi"/>
-          <w:color w:val="000000" w:themeColor="text1"/>
-          <w:sz w:val="20"/>
-          <w:szCs w:val="20"/>
-        </w:rPr>
-        <w:t>can we determine if there is a significant difference between the average number of minutes played per game based on a player’s pick in the first round of the draft</w:t>
-      </w:r>
-      <w:r>
-        <w:rPr>
-          <w:rFonts w:asciiTheme="minorHAnsi" w:hAnsiTheme="minorHAnsi" w:cstheme="minorHAnsi"/>
-          <w:color w:val="000000" w:themeColor="text1"/>
-          <w:sz w:val="20"/>
-          <w:szCs w:val="20"/>
-        </w:rPr>
-        <w:t>? What conclusions can you draw upon first glance of the two data visualizations? Are there any concerns?</w:t>
+        <w:lastRenderedPageBreak/>
+        <w:t>Suppose someone suggests using a one-way ANOVA to compare average minutes per game across the three draft-pick groups. Do the conditions for one-way ANOVA appear reasonable for these data? Explain your answer by discussing both the data source and the graphical displays.</w:t>
       </w:r>
     </w:p>
     <w:p>
       <w:pPr>
         <w:pStyle w:val="ListParagraph"/>
-        <w:rPr>
-          <w:rFonts w:asciiTheme="minorHAnsi" w:hAnsiTheme="minorHAnsi" w:cstheme="minorHAnsi"/>
-          <w:color w:val="000000" w:themeColor="text1"/>
-          <w:sz w:val="20"/>
-          <w:szCs w:val="20"/>
-        </w:rPr>
-      </w:pPr>
-    </w:p>
-    <w:p>
-      <w:pPr>
-        <w:pStyle w:val="ListParagraph"/>
-        <w:rPr>
-          <w:rFonts w:asciiTheme="minorHAnsi" w:hAnsiTheme="minorHAnsi" w:cstheme="minorHAnsi"/>
-          <w:color w:val="FF0000"/>
-          <w:sz w:val="20"/>
-          <w:szCs w:val="20"/>
-        </w:rPr>
-      </w:pPr>
-    </w:p>
-    <w:p>
-      <w:pPr>
-        <w:pStyle w:val="ListParagraph"/>
-        <w:rPr>
-          <w:rFonts w:asciiTheme="minorHAnsi" w:hAnsiTheme="minorHAnsi" w:cstheme="minorHAnsi"/>
-          <w:color w:val="FF0000"/>
-          <w:sz w:val="20"/>
-          <w:szCs w:val="20"/>
-        </w:rPr>
-      </w:pPr>
-    </w:p>
-    <w:p>
-      <w:pPr>
-        <w:pStyle w:val="ListParagraph"/>
-        <w:rPr>
-          <w:rFonts w:asciiTheme="minorHAnsi" w:hAnsiTheme="minorHAnsi" w:cstheme="minorHAnsi"/>
-          <w:color w:val="FF0000"/>
-          <w:sz w:val="20"/>
-          <w:szCs w:val="20"/>
-        </w:rPr>
-      </w:pPr>
-    </w:p>
-    <w:p>
-      <w:pPr>
-        <w:pStyle w:val="ListParagraph"/>
-        <w:rPr>
-          <w:rFonts w:asciiTheme="minorHAnsi" w:hAnsiTheme="minorHAnsi" w:cstheme="minorHAnsi"/>
-          <w:color w:val="000000" w:themeColor="text1"/>
-          <w:sz w:val="20"/>
-          <w:szCs w:val="20"/>
-        </w:rPr>
-      </w:pPr>
-    </w:p>
-    <w:p>
-      <w:pPr>
-        <w:pStyle w:val="ListParagraph"/>
-        <w:rPr>
-          <w:rFonts w:asciiTheme="minorHAnsi" w:hAnsiTheme="minorHAnsi" w:cstheme="minorHAnsi"/>
-          <w:color w:val="000000" w:themeColor="text1"/>
-          <w:sz w:val="20"/>
-          <w:szCs w:val="20"/>
-        </w:rPr>
-      </w:pPr>
-    </w:p>
-    <w:p>
-      <w:pPr>
-        <w:rPr>
-          <w:rFonts w:asciiTheme="minorHAnsi" w:hAnsiTheme="minorHAnsi" w:cstheme="minorHAnsi"/>
-          <w:color w:val="000000" w:themeColor="text1"/>
-          <w:sz w:val="20"/>
-          <w:szCs w:val="20"/>
-        </w:rPr>
-      </w:pPr>
-    </w:p>
-    <w:p>
-      <w:pPr>
-        <w:rPr>
-          <w:rFonts w:asciiTheme="minorHAnsi" w:hAnsiTheme="minorHAnsi" w:cstheme="minorHAnsi"/>
-          <w:color w:val="000000" w:themeColor="text1"/>
-          <w:sz w:val="20"/>
-          <w:szCs w:val="20"/>
-        </w:rPr>
-      </w:pPr>
-    </w:p>
-    <w:p>
-      <w:pPr>
         <w:rPr>
           <w:rFonts w:asciiTheme="minorHAnsi" w:hAnsiTheme="minorHAnsi" w:cstheme="minorHAnsi"/>
           <w:color w:val="000000" w:themeColor="text1"/>
@@ -688,122 +800,41 @@
           <w:sz w:val="20"/>
           <w:szCs w:val="20"/>
         </w:rPr>
-        <w:lastRenderedPageBreak/>
-        <w:t>Assuming an ANOVA test is most likely appropriate for our data, write and interpret in context the null and alternative hypotheses we'll be using to determine if the average number of minutes played per game is diffe</w:t>
-      </w:r>
-      <w:r>
-        <w:rPr>
-          <w:rFonts w:asciiTheme="minorHAnsi" w:hAnsiTheme="minorHAnsi" w:cstheme="minorHAnsi"/>
-          <w:color w:val="000000" w:themeColor="text1"/>
-          <w:sz w:val="20"/>
-          <w:szCs w:val="20"/>
-        </w:rPr>
-        <w:t xml:space="preserve">rs </w:t>
-      </w:r>
-      <w:r>
-        <w:rPr>
-          <w:rFonts w:asciiTheme="minorHAnsi" w:hAnsiTheme="minorHAnsi" w:cstheme="minorHAnsi"/>
-          <w:color w:val="000000" w:themeColor="text1"/>
-          <w:sz w:val="20"/>
-          <w:szCs w:val="20"/>
-        </w:rPr>
-        <w:t>based on the position in which the player is picked in the first round</w:t>
-      </w:r>
-      <w:r>
-        <w:rPr>
-          <w:rFonts w:asciiTheme="minorHAnsi" w:hAnsiTheme="minorHAnsi" w:cstheme="minorHAnsi"/>
-          <w:color w:val="000000" w:themeColor="text1"/>
-          <w:sz w:val="20"/>
-          <w:szCs w:val="20"/>
-        </w:rPr>
-        <w:t>.</w:t>
-      </w:r>
-    </w:p>
-    <w:p>
-      <w:pPr>
-        <w:rPr>
-          <w:rFonts w:asciiTheme="minorHAnsi" w:hAnsiTheme="minorHAnsi" w:cstheme="minorHAnsi"/>
-          <w:color w:val="000000" w:themeColor="text1"/>
-          <w:sz w:val="20"/>
-          <w:szCs w:val="20"/>
-        </w:rPr>
-      </w:pPr>
-    </w:p>
-    <w:p>
-      <w:pPr>
-        <w:rPr>
-          <w:rFonts w:asciiTheme="minorHAnsi" w:hAnsiTheme="minorHAnsi" w:cstheme="minorHAnsi"/>
-          <w:color w:val="FF0000"/>
-          <w:sz w:val="20"/>
-          <w:szCs w:val="20"/>
-        </w:rPr>
-      </w:pPr>
-    </w:p>
-    <w:p>
-      <w:pPr>
-        <w:rPr>
-          <w:rFonts w:asciiTheme="minorHAnsi" w:hAnsiTheme="minorHAnsi" w:cstheme="minorHAnsi"/>
-          <w:color w:val="FF0000"/>
-          <w:sz w:val="20"/>
-          <w:szCs w:val="20"/>
-        </w:rPr>
-      </w:pPr>
-    </w:p>
-    <w:p>
-      <w:pPr>
-        <w:rPr>
-          <w:rFonts w:asciiTheme="minorHAnsi" w:hAnsiTheme="minorHAnsi" w:cstheme="minorHAnsi"/>
-          <w:color w:val="FF0000"/>
-          <w:sz w:val="20"/>
-          <w:szCs w:val="20"/>
-        </w:rPr>
-      </w:pPr>
-    </w:p>
-    <w:p>
-      <w:pPr>
-        <w:rPr>
-          <w:rFonts w:asciiTheme="minorHAnsi" w:hAnsiTheme="minorHAnsi" w:cstheme="minorHAnsi"/>
-          <w:color w:val="FF0000"/>
-          <w:sz w:val="20"/>
-          <w:szCs w:val="20"/>
-        </w:rPr>
-      </w:pPr>
-    </w:p>
-    <w:p>
-      <w:pPr>
-        <w:rPr>
-          <w:rFonts w:asciiTheme="minorHAnsi" w:hAnsiTheme="minorHAnsi" w:cstheme="minorHAnsi"/>
-          <w:color w:val="FF0000"/>
-          <w:sz w:val="20"/>
-          <w:szCs w:val="20"/>
-        </w:rPr>
-      </w:pPr>
-    </w:p>
-    <w:p>
-      <w:pPr>
-        <w:rPr>
-          <w:rFonts w:asciiTheme="minorHAnsi" w:hAnsiTheme="minorHAnsi" w:cstheme="minorHAnsi"/>
-          <w:color w:val="FF0000"/>
-          <w:sz w:val="20"/>
-          <w:szCs w:val="20"/>
-        </w:rPr>
-      </w:pPr>
-    </w:p>
-    <w:p>
-      <w:pPr>
-        <w:rPr>
-          <w:rFonts w:asciiTheme="minorHAnsi" w:hAnsiTheme="minorHAnsi" w:cstheme="minorHAnsi"/>
-          <w:color w:val="FF0000"/>
-          <w:sz w:val="20"/>
-          <w:szCs w:val="20"/>
-        </w:rPr>
-      </w:pPr>
-    </w:p>
-    <w:p>
-      <w:pPr>
-        <w:rPr>
-          <w:rFonts w:asciiTheme="minorHAnsi" w:hAnsiTheme="minorHAnsi" w:cstheme="minorHAnsi"/>
-          <w:color w:val="FF0000"/>
+        <w:t xml:space="preserve">Regardless of your answer to the previous question, </w:t>
+      </w:r>
+      <w:r>
+        <w:rPr>
+          <w:rFonts w:asciiTheme="minorHAnsi" w:hAnsiTheme="minorHAnsi" w:cstheme="minorHAnsi"/>
+          <w:color w:val="000000" w:themeColor="text1"/>
+          <w:sz w:val="20"/>
+          <w:szCs w:val="20"/>
+        </w:rPr>
+        <w:t xml:space="preserve">write the null and alternative hypotheses for testing whether average career minutes per game differs among the three draft-pick groups. Use standard notation and </w:t>
+      </w:r>
+      <w:r>
+        <w:rPr>
+          <w:rFonts w:asciiTheme="minorHAnsi" w:hAnsiTheme="minorHAnsi" w:cstheme="minorHAnsi"/>
+          <w:color w:val="000000" w:themeColor="text1"/>
+          <w:sz w:val="20"/>
+          <w:szCs w:val="20"/>
+        </w:rPr>
+        <w:t xml:space="preserve">also </w:t>
+      </w:r>
+      <w:r>
+        <w:rPr>
+          <w:rFonts w:asciiTheme="minorHAnsi" w:hAnsiTheme="minorHAnsi" w:cstheme="minorHAnsi"/>
+          <w:color w:val="000000" w:themeColor="text1"/>
+          <w:sz w:val="20"/>
+          <w:szCs w:val="20"/>
+        </w:rPr>
+        <w:t>interpret each hypothesis in context.</w:t>
+      </w:r>
+    </w:p>
+    <w:p>
+      <w:pPr>
+        <w:rPr>
+          <w:rFonts w:asciiTheme="minorHAnsi" w:hAnsiTheme="minorHAnsi" w:cstheme="minorHAnsi"/>
+          <w:color w:val="000000" w:themeColor="text1"/>
           <w:sz w:val="20"/>
           <w:szCs w:val="20"/>
         </w:rPr>
@@ -830,7 +861,34 @@
           <w:sz w:val="20"/>
           <w:szCs w:val="20"/>
         </w:rPr>
-        <w:t xml:space="preserve"> Using the statistics for each category provided below, fill in the ANOVA table and use it to answer the following questions. </w:t>
+        <w:t xml:space="preserve">Using the </w:t>
+      </w:r>
+      <w:r>
+        <w:rPr>
+          <w:rFonts w:asciiTheme="minorHAnsi" w:hAnsiTheme="minorHAnsi" w:cstheme="minorHAnsi"/>
+          <w:color w:val="000000" w:themeColor="text1"/>
+          <w:sz w:val="20"/>
+          <w:szCs w:val="20"/>
+        </w:rPr>
+        <w:t xml:space="preserve">information </w:t>
+      </w:r>
+      <w:r>
+        <w:rPr>
+          <w:rFonts w:asciiTheme="minorHAnsi" w:hAnsiTheme="minorHAnsi" w:cstheme="minorHAnsi"/>
+          <w:color w:val="000000" w:themeColor="text1"/>
+          <w:sz w:val="20"/>
+          <w:szCs w:val="20"/>
+        </w:rPr>
+        <w:t>provided</w:t>
+      </w:r>
+      <w:r>
+        <w:rPr>
+          <w:rFonts w:asciiTheme="minorHAnsi" w:hAnsiTheme="minorHAnsi" w:cstheme="minorHAnsi"/>
+          <w:color w:val="000000" w:themeColor="text1"/>
+          <w:sz w:val="20"/>
+          <w:szCs w:val="20"/>
+        </w:rPr>
+        <w:t xml:space="preserve"> below, fill in the ANOVA table.</w:t>
       </w:r>
     </w:p>
     <w:p>
@@ -852,7 +910,7 @@
           <w:szCs w:val="20"/>
         </w:rPr>
         <w:drawing>
-          <wp:anchor distT="0" distB="0" distL="114300" distR="114300" simplePos="0" relativeHeight="251661312" behindDoc="0" locked="0" layoutInCell="1" allowOverlap="1" wp14:anchorId="594F2A17" wp14:editId="0FD78F97">
+          <wp:anchor distT="0" distB="0" distL="114300" distR="114300" simplePos="0" relativeHeight="251663360" behindDoc="0" locked="0" layoutInCell="1" allowOverlap="1" wp14:anchorId="28940AFE" wp14:editId="729BBECB">
             <wp:simplePos x="0" y="0"/>
             <wp:positionH relativeFrom="column">
               <wp:posOffset>1375825</wp:posOffset>
@@ -964,18 +1022,27 @@
         <w:rPr>
           <w:rFonts w:asciiTheme="minorHAnsi" w:hAnsiTheme="minorHAnsi" w:cstheme="minorHAnsi"/>
           <w:color w:val="000000" w:themeColor="text1"/>
-          <w:sz w:val="16"/>
-          <w:szCs w:val="16"/>
-        </w:rPr>
-      </w:pPr>
-      <w:r>
-        <w:rPr>
-          <w:rFonts w:asciiTheme="minorHAnsi" w:hAnsiTheme="minorHAnsi" w:cstheme="minorHAnsi"/>
-          <w:color w:val="000000" w:themeColor="text1"/>
-          <w:sz w:val="16"/>
-          <w:szCs w:val="16"/>
-        </w:rPr>
-        <w:t xml:space="preserve">k = number of groups </w:t>
+          <w:sz w:val="20"/>
+          <w:szCs w:val="20"/>
+        </w:rPr>
+      </w:pPr>
+      <w:r>
+        <w:rPr>
+          <w:rFonts w:asciiTheme="minorHAnsi" w:hAnsiTheme="minorHAnsi" w:cstheme="minorHAnsi"/>
+          <w:color w:val="000000" w:themeColor="text1"/>
+          <w:sz w:val="20"/>
+          <w:szCs w:val="20"/>
+        </w:rPr>
+        <w:t>k</w:t>
+      </w:r>
+      <w:r>
+        <w:rPr>
+          <w:rFonts w:asciiTheme="minorHAnsi" w:hAnsiTheme="minorHAnsi" w:cstheme="minorHAnsi"/>
+          <w:color w:val="000000" w:themeColor="text1"/>
+          <w:sz w:val="20"/>
+          <w:szCs w:val="20"/>
+        </w:rPr>
+        <w:t xml:space="preserve"> = number of groups </w:t>
       </w:r>
     </w:p>
     <w:p>
@@ -984,18 +1051,94 @@
         <w:rPr>
           <w:rFonts w:asciiTheme="minorHAnsi" w:hAnsiTheme="minorHAnsi" w:cstheme="minorHAnsi"/>
           <w:color w:val="000000" w:themeColor="text1"/>
-          <w:sz w:val="16"/>
-          <w:szCs w:val="16"/>
-        </w:rPr>
-      </w:pPr>
-      <w:r>
-        <w:rPr>
-          <w:rFonts w:asciiTheme="minorHAnsi" w:hAnsiTheme="minorHAnsi" w:cstheme="minorHAnsi"/>
-          <w:color w:val="000000" w:themeColor="text1"/>
-          <w:sz w:val="16"/>
-          <w:szCs w:val="16"/>
-        </w:rPr>
-        <w:t xml:space="preserve">n = total sample size </w:t>
+          <w:sz w:val="20"/>
+          <w:szCs w:val="20"/>
+        </w:rPr>
+      </w:pPr>
+      <w:r>
+        <w:rPr>
+          <w:rFonts w:asciiTheme="minorHAnsi" w:hAnsiTheme="minorHAnsi" w:cstheme="minorHAnsi"/>
+          <w:color w:val="000000" w:themeColor="text1"/>
+          <w:sz w:val="20"/>
+          <w:szCs w:val="20"/>
+        </w:rPr>
+        <w:t>n</w:t>
+      </w:r>
+      <w:r>
+        <w:rPr>
+          <w:rFonts w:asciiTheme="minorHAnsi" w:hAnsiTheme="minorHAnsi" w:cstheme="minorHAnsi"/>
+          <w:color w:val="000000" w:themeColor="text1"/>
+          <w:sz w:val="20"/>
+          <w:szCs w:val="20"/>
+        </w:rPr>
+        <w:t xml:space="preserve"> = total sample size </w:t>
+      </w:r>
+    </w:p>
+    <w:p>
+      <w:pPr>
+        <w:ind w:left="2160"/>
+        <w:rPr>
+          <w:rFonts w:asciiTheme="minorHAnsi" w:hAnsiTheme="minorHAnsi" w:cstheme="minorHAnsi"/>
+          <w:color w:val="000000" w:themeColor="text1"/>
+          <w:sz w:val="20"/>
+          <w:szCs w:val="20"/>
+        </w:rPr>
+      </w:pPr>
+    </w:p>
+    <w:p>
+      <w:pPr>
+        <w:ind w:left="720"/>
+        <w:rPr>
+          <w:rFonts w:asciiTheme="minorHAnsi" w:hAnsiTheme="minorHAnsi" w:cstheme="minorHAnsi"/>
+          <w:color w:val="000000" w:themeColor="text1"/>
+          <w:sz w:val="20"/>
+          <w:szCs w:val="20"/>
+        </w:rPr>
+      </w:pPr>
+      <w:r>
+        <w:rPr>
+          <w:rFonts w:asciiTheme="minorHAnsi" w:hAnsiTheme="minorHAnsi" w:cstheme="minorHAnsi"/>
+          <w:color w:val="000000" w:themeColor="text1"/>
+          <w:sz w:val="20"/>
+          <w:szCs w:val="20"/>
+        </w:rPr>
+        <w:t>Additionally, for the entire dataset, the mean minutes per game was 21.506</w:t>
+      </w:r>
+      <w:r>
+        <w:rPr>
+          <w:rFonts w:asciiTheme="minorHAnsi" w:hAnsiTheme="minorHAnsi" w:cstheme="minorHAnsi"/>
+          <w:color w:val="000000" w:themeColor="text1"/>
+          <w:sz w:val="20"/>
+          <w:szCs w:val="20"/>
+        </w:rPr>
+        <w:t xml:space="preserve"> minutes</w:t>
+      </w:r>
+      <w:r>
+        <w:rPr>
+          <w:rFonts w:asciiTheme="minorHAnsi" w:hAnsiTheme="minorHAnsi" w:cstheme="minorHAnsi"/>
+          <w:color w:val="000000" w:themeColor="text1"/>
+          <w:sz w:val="20"/>
+          <w:szCs w:val="20"/>
+        </w:rPr>
+        <w:t xml:space="preserve"> with a standard deviation of 8.060</w:t>
+      </w:r>
+      <w:r>
+        <w:rPr>
+          <w:rFonts w:asciiTheme="minorHAnsi" w:hAnsiTheme="minorHAnsi" w:cstheme="minorHAnsi"/>
+          <w:color w:val="000000" w:themeColor="text1"/>
+          <w:sz w:val="20"/>
+          <w:szCs w:val="20"/>
+        </w:rPr>
+        <w:t xml:space="preserve"> minutes</w:t>
+      </w:r>
+      <w:r>
+        <w:rPr>
+          <w:rFonts w:asciiTheme="minorHAnsi" w:hAnsiTheme="minorHAnsi" w:cstheme="minorHAnsi"/>
+          <w:color w:val="000000" w:themeColor="text1"/>
+          <w:sz w:val="20"/>
+          <w:szCs w:val="20"/>
+        </w:rPr>
+        <w:t>.</w:t>
       </w:r>
     </w:p>
     <w:p>
@@ -1024,6 +1167,9 @@
         <w:gridCol w:w="1624"/>
       </w:tblGrid>
       <w:tr>
+        <w:trPr>
+          <w:trHeight w:val="20"/>
+        </w:trPr>
         <w:tc>
           <w:tcPr>
             <w:tcW w:w="1768" w:type="dxa"/>
@@ -1316,6 +1462,9 @@
         </w:tc>
       </w:tr>
       <w:tr>
+        <w:trPr>
+          <w:trHeight w:val="20"/>
+        </w:trPr>
         <w:tc>
           <w:tcPr>
             <w:tcW w:w="1768" w:type="dxa"/>
@@ -1348,7 +1497,144 @@
                 <w:sz w:val="20"/>
                 <w:szCs w:val="20"/>
               </w:rPr>
-              <w:t>Pick in Draft</w:t>
+              <w:t>Draft-Pick Group</w:t>
+            </w:r>
+          </w:p>
+          <w:p>
+            <w:pPr>
+              <w:jc w:val="center"/>
+              <w:rPr>
+                <w:rFonts w:asciiTheme="minorHAnsi" w:hAnsiTheme="minorHAnsi" w:cstheme="minorHAnsi"/>
+                <w:color w:val="000000" w:themeColor="text1"/>
+                <w:sz w:val="20"/>
+                <w:szCs w:val="20"/>
+              </w:rPr>
+            </w:pPr>
+          </w:p>
+        </w:tc>
+        <w:tc>
+          <w:tcPr>
+            <w:tcW w:w="1710" w:type="dxa"/>
+          </w:tcPr>
+          <w:p>
+            <w:pPr>
+              <w:jc w:val="center"/>
+              <w:rPr>
+                <w:rFonts w:asciiTheme="minorHAnsi" w:hAnsiTheme="minorHAnsi" w:cstheme="minorHAnsi"/>
+                <w:color w:val="FF0000"/>
+                <w:sz w:val="20"/>
+                <w:szCs w:val="20"/>
+              </w:rPr>
+            </w:pPr>
+          </w:p>
+        </w:tc>
+        <w:tc>
+          <w:tcPr>
+            <w:tcW w:w="1709" w:type="dxa"/>
+          </w:tcPr>
+          <w:p>
+            <w:pPr>
+              <w:jc w:val="center"/>
+              <w:rPr>
+                <w:rFonts w:asciiTheme="minorHAnsi" w:hAnsiTheme="minorHAnsi" w:cstheme="minorHAnsi"/>
+                <w:color w:val="FF0000"/>
+                <w:sz w:val="20"/>
+                <w:szCs w:val="20"/>
+              </w:rPr>
+            </w:pPr>
+          </w:p>
+        </w:tc>
+        <w:tc>
+          <w:tcPr>
+            <w:tcW w:w="1529" w:type="dxa"/>
+            <w:shd w:val="clear" w:color="auto" w:fill="auto"/>
+          </w:tcPr>
+          <w:p>
+            <w:pPr>
+              <w:jc w:val="center"/>
+              <w:rPr>
+                <w:rFonts w:asciiTheme="minorHAnsi" w:hAnsiTheme="minorHAnsi" w:cstheme="minorHAnsi"/>
+                <w:color w:val="FF0000"/>
+                <w:sz w:val="20"/>
+                <w:szCs w:val="20"/>
+              </w:rPr>
+            </w:pPr>
+          </w:p>
+        </w:tc>
+        <w:tc>
+          <w:tcPr>
+            <w:tcW w:w="1529" w:type="dxa"/>
+            <w:shd w:val="clear" w:color="auto" w:fill="auto"/>
+          </w:tcPr>
+          <w:p>
+            <w:pPr>
+              <w:jc w:val="center"/>
+              <w:rPr>
+                <w:rFonts w:asciiTheme="minorHAnsi" w:hAnsiTheme="minorHAnsi" w:cstheme="minorHAnsi"/>
+                <w:color w:val="FF0000"/>
+                <w:sz w:val="20"/>
+                <w:szCs w:val="20"/>
+              </w:rPr>
+            </w:pPr>
+          </w:p>
+        </w:tc>
+        <w:tc>
+          <w:tcPr>
+            <w:tcW w:w="1624" w:type="dxa"/>
+            <w:shd w:val="clear" w:color="auto" w:fill="auto"/>
+          </w:tcPr>
+          <w:p>
+            <w:pPr>
+              <w:jc w:val="center"/>
+              <w:rPr>
+                <w:rFonts w:asciiTheme="minorHAnsi" w:hAnsiTheme="minorHAnsi" w:cstheme="minorHAnsi"/>
+                <w:color w:val="FF0000"/>
+                <w:sz w:val="20"/>
+                <w:szCs w:val="20"/>
+              </w:rPr>
+            </w:pPr>
+          </w:p>
+        </w:tc>
+      </w:tr>
+      <w:tr>
+        <w:trPr>
+          <w:gridAfter w:val="2"/>
+          <w:wAfter w:w="3153" w:type="dxa"/>
+          <w:trHeight w:val="20"/>
+        </w:trPr>
+        <w:tc>
+          <w:tcPr>
+            <w:tcW w:w="1768" w:type="dxa"/>
+          </w:tcPr>
+          <w:p>
+            <w:pPr>
+              <w:jc w:val="center"/>
+              <w:rPr>
+                <w:rFonts w:asciiTheme="minorHAnsi" w:hAnsiTheme="minorHAnsi" w:cstheme="minorHAnsi"/>
+                <w:color w:val="000000" w:themeColor="text1"/>
+                <w:sz w:val="20"/>
+                <w:szCs w:val="20"/>
+              </w:rPr>
+            </w:pPr>
+          </w:p>
+          <w:p>
+            <w:pPr>
+              <w:jc w:val="center"/>
+              <w:rPr>
+                <w:rFonts w:asciiTheme="minorHAnsi" w:hAnsiTheme="minorHAnsi" w:cstheme="minorHAnsi"/>
+                <w:color w:val="000000" w:themeColor="text1"/>
+                <w:sz w:val="20"/>
+                <w:szCs w:val="20"/>
+              </w:rPr>
+            </w:pPr>
+            <w:r>
+              <w:rPr>
+                <w:rFonts w:asciiTheme="minorHAnsi" w:hAnsiTheme="minorHAnsi" w:cstheme="minorHAnsi"/>
+                <w:color w:val="000000" w:themeColor="text1"/>
+                <w:sz w:val="20"/>
+                <w:szCs w:val="20"/>
+              </w:rPr>
+              <w:t>Error</w:t>
             </w:r>
           </w:p>
           <w:p>
@@ -1394,35 +1680,6 @@
               </w:rPr>
             </w:pPr>
           </w:p>
-          <w:p>
-            <w:pPr>
-              <w:pStyle w:val="HTMLPreformatted"/>
-              <w:shd w:val="clear" w:color="auto" w:fill="FFFFFF"/>
-              <w:jc w:val="center"/>
-              <w:rPr>
-                <w:rFonts w:asciiTheme="minorHAnsi" w:hAnsiTheme="minorHAnsi" w:cstheme="minorHAnsi"/>
-                <w:color w:val="000000"/>
-              </w:rPr>
-            </w:pPr>
-            <w:r>
-              <w:rPr>
-                <w:rFonts w:asciiTheme="minorHAnsi" w:hAnsiTheme="minorHAnsi" w:cstheme="minorHAnsi"/>
-                <w:color w:val="000000"/>
-              </w:rPr>
-              <w:t>13839</w:t>
-            </w:r>
-          </w:p>
-          <w:p>
-            <w:pPr>
-              <w:jc w:val="center"/>
-              <w:rPr>
-                <w:rFonts w:asciiTheme="minorHAnsi" w:hAnsiTheme="minorHAnsi" w:cstheme="minorHAnsi"/>
-                <w:color w:val="000000" w:themeColor="text1"/>
-                <w:sz w:val="20"/>
-                <w:szCs w:val="20"/>
-              </w:rPr>
-            </w:pPr>
-          </w:p>
         </w:tc>
         <w:tc>
           <w:tcPr>
@@ -1441,76 +1698,12 @@
             </w:pPr>
           </w:p>
         </w:tc>
-        <w:tc>
-          <w:tcPr>
-            <w:tcW w:w="1529" w:type="dxa"/>
-            <w:shd w:val="clear" w:color="auto" w:fill="auto"/>
-          </w:tcPr>
-          <w:p>
-            <w:pPr>
-              <w:jc w:val="center"/>
-              <w:rPr>
-                <w:rFonts w:asciiTheme="minorHAnsi" w:hAnsiTheme="minorHAnsi" w:cstheme="minorHAnsi"/>
-                <w:color w:val="000000" w:themeColor="text1"/>
-                <w:sz w:val="20"/>
-                <w:szCs w:val="20"/>
-              </w:rPr>
-            </w:pPr>
-          </w:p>
-        </w:tc>
-        <w:tc>
-          <w:tcPr>
-            <w:tcW w:w="1624" w:type="dxa"/>
-            <w:shd w:val="clear" w:color="auto" w:fill="auto"/>
-          </w:tcPr>
-          <w:p>
-            <w:pPr>
-              <w:jc w:val="center"/>
-              <w:rPr>
-                <w:rFonts w:asciiTheme="minorHAnsi" w:hAnsiTheme="minorHAnsi" w:cstheme="minorHAnsi"/>
-                <w:color w:val="000000" w:themeColor="text1"/>
-                <w:sz w:val="20"/>
-                <w:szCs w:val="20"/>
-              </w:rPr>
-            </w:pPr>
-          </w:p>
-          <w:p>
-            <w:pPr>
-              <w:jc w:val="center"/>
-              <w:rPr>
-                <w:rFonts w:asciiTheme="minorHAnsi" w:hAnsiTheme="minorHAnsi" w:cstheme="minorHAnsi"/>
-                <w:color w:val="000000" w:themeColor="text1"/>
-                <w:sz w:val="20"/>
-                <w:szCs w:val="20"/>
-              </w:rPr>
-            </w:pPr>
-            <m:oMath>
-              <m:r>
-                <w:rPr>
-                  <w:rFonts w:ascii="Cambria Math" w:hAnsi="Cambria Math" w:cstheme="minorHAnsi"/>
-                  <w:color w:val="000000" w:themeColor="text1"/>
-                  <w:sz w:val="20"/>
-                  <w:szCs w:val="20"/>
-                </w:rPr>
-                <m:t>≈</m:t>
-              </m:r>
-            </m:oMath>
-            <w:r>
-              <w:rPr>
-                <w:rFonts w:asciiTheme="minorHAnsi" w:hAnsiTheme="minorHAnsi" w:cstheme="minorHAnsi"/>
-                <w:color w:val="000000" w:themeColor="text1"/>
-                <w:sz w:val="20"/>
-                <w:szCs w:val="20"/>
-              </w:rPr>
-              <w:t>0.000</w:t>
-            </w:r>
-          </w:p>
-        </w:tc>
       </w:tr>
       <w:tr>
         <w:trPr>
-          <w:gridAfter w:val="2"/>
-          <w:wAfter w:w="3153" w:type="dxa"/>
+          <w:gridAfter w:val="3"/>
+          <w:wAfter w:w="4682" w:type="dxa"/>
+          <w:trHeight w:val="20"/>
         </w:trPr>
         <w:tc>
           <w:tcPr>
@@ -1544,7 +1737,7 @@
                 <w:sz w:val="20"/>
                 <w:szCs w:val="20"/>
               </w:rPr>
-              <w:t>Error</w:t>
+              <w:t>Total</w:t>
             </w:r>
           </w:p>
           <w:p>
@@ -1581,144 +1774,13 @@
           </w:tcPr>
           <w:p>
             <w:pPr>
-              <w:pStyle w:val="HTMLPreformatted"/>
-              <w:shd w:val="clear" w:color="auto" w:fill="FFFFFF"/>
               <w:jc w:val="center"/>
               <w:rPr>
                 <w:rFonts w:asciiTheme="minorHAnsi" w:hAnsiTheme="minorHAnsi" w:cstheme="minorHAnsi"/>
-                <w:color w:val="000000"/>
+                <w:sz w:val="20"/>
+                <w:szCs w:val="20"/>
               </w:rPr>
             </w:pPr>
-          </w:p>
-        </w:tc>
-        <w:tc>
-          <w:tcPr>
-            <w:tcW w:w="1529" w:type="dxa"/>
-            <w:shd w:val="clear" w:color="auto" w:fill="auto"/>
-          </w:tcPr>
-          <w:p>
-            <w:pPr>
-              <w:jc w:val="center"/>
-              <w:rPr>
-                <w:rFonts w:asciiTheme="minorHAnsi" w:hAnsiTheme="minorHAnsi" w:cstheme="minorHAnsi"/>
-                <w:color w:val="FF0000"/>
-                <w:sz w:val="20"/>
-                <w:szCs w:val="20"/>
-              </w:rPr>
-            </w:pPr>
-            <w:r>
-              <w:rPr>
-                <w:rFonts w:asciiTheme="minorHAnsi" w:hAnsiTheme="minorHAnsi" w:cstheme="minorHAnsi"/>
-                <w:color w:val="FF0000"/>
-                <w:sz w:val="20"/>
-                <w:szCs w:val="20"/>
-              </w:rPr>
-              <w:t xml:space="preserve"> </w:t>
-            </w:r>
-          </w:p>
-        </w:tc>
-      </w:tr>
-      <w:tr>
-        <w:trPr>
-          <w:gridAfter w:val="3"/>
-          <w:wAfter w:w="4682" w:type="dxa"/>
-        </w:trPr>
-        <w:tc>
-          <w:tcPr>
-            <w:tcW w:w="1768" w:type="dxa"/>
-          </w:tcPr>
-          <w:p>
-            <w:pPr>
-              <w:jc w:val="center"/>
-              <w:rPr>
-                <w:rFonts w:asciiTheme="minorHAnsi" w:hAnsiTheme="minorHAnsi" w:cstheme="minorHAnsi"/>
-                <w:color w:val="000000" w:themeColor="text1"/>
-                <w:sz w:val="20"/>
-                <w:szCs w:val="20"/>
-              </w:rPr>
-            </w:pPr>
-          </w:p>
-          <w:p>
-            <w:pPr>
-              <w:jc w:val="center"/>
-              <w:rPr>
-                <w:rFonts w:asciiTheme="minorHAnsi" w:hAnsiTheme="minorHAnsi" w:cstheme="minorHAnsi"/>
-                <w:color w:val="000000" w:themeColor="text1"/>
-                <w:sz w:val="20"/>
-                <w:szCs w:val="20"/>
-              </w:rPr>
-            </w:pPr>
-            <w:r>
-              <w:rPr>
-                <w:rFonts w:asciiTheme="minorHAnsi" w:hAnsiTheme="minorHAnsi" w:cstheme="minorHAnsi"/>
-                <w:color w:val="000000" w:themeColor="text1"/>
-                <w:sz w:val="20"/>
-                <w:szCs w:val="20"/>
-              </w:rPr>
-              <w:t>Total</w:t>
-            </w:r>
-          </w:p>
-          <w:p>
-            <w:pPr>
-              <w:jc w:val="center"/>
-              <w:rPr>
-                <w:rFonts w:asciiTheme="minorHAnsi" w:hAnsiTheme="minorHAnsi" w:cstheme="minorHAnsi"/>
-                <w:color w:val="000000" w:themeColor="text1"/>
-                <w:sz w:val="20"/>
-                <w:szCs w:val="20"/>
-              </w:rPr>
-            </w:pPr>
-          </w:p>
-        </w:tc>
-        <w:tc>
-          <w:tcPr>
-            <w:tcW w:w="1710" w:type="dxa"/>
-          </w:tcPr>
-          <w:p>
-            <w:pPr>
-              <w:jc w:val="center"/>
-              <w:rPr>
-                <w:rFonts w:asciiTheme="minorHAnsi" w:hAnsiTheme="minorHAnsi" w:cstheme="minorHAnsi"/>
-                <w:color w:val="FF0000"/>
-                <w:sz w:val="20"/>
-                <w:szCs w:val="20"/>
-              </w:rPr>
-            </w:pPr>
-          </w:p>
-        </w:tc>
-        <w:tc>
-          <w:tcPr>
-            <w:tcW w:w="1709" w:type="dxa"/>
-          </w:tcPr>
-          <w:p>
-            <w:pPr>
-              <w:jc w:val="center"/>
-              <w:rPr>
-                <w:rFonts w:asciiTheme="minorHAnsi" w:hAnsiTheme="minorHAnsi" w:cstheme="minorHAnsi"/>
-                <w:color w:val="FF0000"/>
-                <w:sz w:val="20"/>
-                <w:szCs w:val="20"/>
-              </w:rPr>
-            </w:pPr>
-          </w:p>
-          <w:p>
-            <w:pPr>
-              <w:jc w:val="center"/>
-              <w:rPr>
-                <w:rFonts w:asciiTheme="minorHAnsi" w:hAnsiTheme="minorHAnsi" w:cstheme="minorHAnsi"/>
-                <w:sz w:val="20"/>
-                <w:szCs w:val="20"/>
-              </w:rPr>
-            </w:pPr>
-            <w:r>
-              <w:rPr>
-                <w:rFonts w:asciiTheme="minorHAnsi" w:hAnsiTheme="minorHAnsi" w:cstheme="minorHAnsi"/>
-                <w:color w:val="000000" w:themeColor="text1"/>
-                <w:sz w:val="20"/>
-                <w:szCs w:val="20"/>
-              </w:rPr>
-              <w:t>60091</w:t>
-            </w:r>
           </w:p>
         </w:tc>
       </w:tr>
@@ -1736,62 +1798,21 @@
     <w:p>
       <w:pPr>
         <w:rPr>
-          <w:rFonts w:asciiTheme="minorHAnsi" w:hAnsiTheme="minorHAnsi" w:cstheme="minorHAnsi"/>
-          <w:color w:val="000000" w:themeColor="text1"/>
-          <w:sz w:val="20"/>
-          <w:szCs w:val="20"/>
-        </w:rPr>
-      </w:pPr>
-    </w:p>
-    <w:p>
-      <w:pPr>
-        <w:rPr>
-          <w:rFonts w:asciiTheme="minorHAnsi" w:hAnsiTheme="minorHAnsi" w:cstheme="minorHAnsi"/>
-          <w:color w:val="000000" w:themeColor="text1"/>
-          <w:sz w:val="20"/>
-          <w:szCs w:val="20"/>
-        </w:rPr>
-      </w:pPr>
-    </w:p>
-    <w:p>
-      <w:pPr>
-        <w:rPr>
-          <w:rFonts w:asciiTheme="minorHAnsi" w:hAnsiTheme="minorHAnsi" w:cstheme="minorHAnsi"/>
-          <w:color w:val="000000" w:themeColor="text1"/>
-          <w:sz w:val="20"/>
-          <w:szCs w:val="20"/>
-        </w:rPr>
-      </w:pPr>
-    </w:p>
-    <w:p>
-      <w:pPr>
-        <w:rPr>
-          <w:rFonts w:asciiTheme="minorHAnsi" w:hAnsiTheme="minorHAnsi" w:cstheme="minorHAnsi"/>
-          <w:color w:val="000000" w:themeColor="text1"/>
-          <w:sz w:val="20"/>
-          <w:szCs w:val="20"/>
-        </w:rPr>
-      </w:pPr>
-    </w:p>
-    <w:p>
-      <w:pPr>
-        <w:rPr>
-          <w:rFonts w:asciiTheme="minorHAnsi" w:hAnsiTheme="minorHAnsi" w:cstheme="minorHAnsi"/>
-          <w:color w:val="000000" w:themeColor="text1"/>
-          <w:sz w:val="20"/>
-          <w:szCs w:val="20"/>
-        </w:rPr>
-      </w:pPr>
-    </w:p>
-    <w:p>
-      <w:pPr>
-        <w:rPr>
-          <w:rFonts w:asciiTheme="minorHAnsi" w:hAnsiTheme="minorHAnsi" w:cstheme="minorHAnsi"/>
-          <w:color w:val="000000" w:themeColor="text1"/>
-          <w:sz w:val="20"/>
-          <w:szCs w:val="20"/>
-        </w:rPr>
-      </w:pPr>
+          <w:rFonts w:asciiTheme="minorHAnsi" w:eastAsiaTheme="minorEastAsia" w:hAnsiTheme="minorHAnsi" w:cstheme="minorHAnsi"/>
+          <w:color w:val="FF0000"/>
+          <w:sz w:val="20"/>
+          <w:szCs w:val="20"/>
+        </w:rPr>
+      </w:pPr>
+      <w:r>
+        <w:rPr>
+          <w:rFonts w:asciiTheme="minorHAnsi" w:hAnsiTheme="minorHAnsi" w:cstheme="minorHAnsi"/>
+          <w:color w:val="FF0000"/>
+          <w:sz w:val="20"/>
+          <w:szCs w:val="20"/>
+        </w:rPr>
+        <w:tab/>
+      </w:r>
     </w:p>
     <w:p>
       <w:pPr>
@@ -1814,57 +1835,8 @@
           <w:sz w:val="20"/>
           <w:szCs w:val="20"/>
         </w:rPr>
-        <w:t>Is there a significant</w:t>
-      </w:r>
-      <w:r>
-        <w:rPr>
-          <w:rFonts w:asciiTheme="minorHAnsi" w:hAnsiTheme="minorHAnsi" w:cstheme="minorHAnsi"/>
-          <w:color w:val="000000" w:themeColor="text1"/>
-          <w:sz w:val="20"/>
-          <w:szCs w:val="20"/>
-        </w:rPr>
-        <w:t xml:space="preserve"> difference in the mean number of minutes played per game based on when a player was selected in the draft?</w:t>
-      </w:r>
-    </w:p>
-    <w:p>
-      <w:pPr>
-        <w:rPr>
-          <w:rFonts w:asciiTheme="minorHAnsi" w:hAnsiTheme="minorHAnsi" w:cstheme="minorHAnsi"/>
-          <w:color w:val="000000" w:themeColor="text1"/>
-          <w:sz w:val="20"/>
-          <w:szCs w:val="20"/>
-        </w:rPr>
-      </w:pPr>
-    </w:p>
-    <w:p>
-      <w:pPr>
-        <w:rPr>
-          <w:rFonts w:asciiTheme="minorHAnsi" w:hAnsiTheme="minorHAnsi" w:cstheme="minorHAnsi"/>
-          <w:color w:val="000000" w:themeColor="text1"/>
-          <w:sz w:val="20"/>
-          <w:szCs w:val="20"/>
-        </w:rPr>
-      </w:pPr>
-    </w:p>
-    <w:p>
-      <w:pPr>
-        <w:rPr>
-          <w:rFonts w:asciiTheme="minorHAnsi" w:hAnsiTheme="minorHAnsi" w:cstheme="minorHAnsi"/>
-          <w:color w:val="000000" w:themeColor="text1"/>
-          <w:sz w:val="20"/>
-          <w:szCs w:val="20"/>
-        </w:rPr>
-      </w:pPr>
-    </w:p>
-    <w:p>
-      <w:pPr>
-        <w:rPr>
-          <w:rFonts w:asciiTheme="minorHAnsi" w:hAnsiTheme="minorHAnsi" w:cstheme="minorHAnsi"/>
-          <w:color w:val="000000" w:themeColor="text1"/>
-          <w:sz w:val="20"/>
-          <w:szCs w:val="20"/>
-        </w:rPr>
-      </w:pPr>
+        <w:t>Based on the ANOVA table, is there statistically significant evidence that mean career minutes per game differs among the three draft-pick groups? Explain your conclusion in context.</w:t>
+      </w:r>
     </w:p>
     <w:p>
       <w:pPr>
@@ -1897,7 +1869,34 @@
           <w:sz w:val="20"/>
           <w:szCs w:val="20"/>
         </w:rPr>
-        <w:t xml:space="preserve">Between which groups are we </w:t>
+        <w:t xml:space="preserve">Between which groups </w:t>
+      </w:r>
+      <w:r>
+        <w:rPr>
+          <w:rFonts w:asciiTheme="minorHAnsi" w:hAnsiTheme="minorHAnsi" w:cstheme="minorHAnsi"/>
+          <w:color w:val="000000" w:themeColor="text1"/>
+          <w:sz w:val="20"/>
+          <w:szCs w:val="20"/>
+        </w:rPr>
+        <w:t>would</w:t>
+      </w:r>
+      <w:r>
+        <w:rPr>
+          <w:rFonts w:asciiTheme="minorHAnsi" w:hAnsiTheme="minorHAnsi" w:cstheme="minorHAnsi"/>
+          <w:color w:val="000000" w:themeColor="text1"/>
+          <w:sz w:val="20"/>
+          <w:szCs w:val="20"/>
+        </w:rPr>
+        <w:t xml:space="preserve"> we </w:t>
+      </w:r>
+      <w:r>
+        <w:rPr>
+          <w:rFonts w:asciiTheme="minorHAnsi" w:hAnsiTheme="minorHAnsi" w:cstheme="minorHAnsi"/>
+          <w:color w:val="000000" w:themeColor="text1"/>
+          <w:sz w:val="20"/>
+          <w:szCs w:val="20"/>
+        </w:rPr>
+        <w:t xml:space="preserve">be </w:t>
       </w:r>
       <w:r>
         <w:rPr>
@@ -1917,7 +1916,70 @@
           <w:sz w:val="20"/>
           <w:szCs w:val="20"/>
         </w:rPr>
-        <w:t xml:space="preserve"> to see a significant difference. Between which groups are we </w:t>
+        <w:t xml:space="preserve"> to see a </w:t>
+      </w:r>
+      <w:r>
+        <w:rPr>
+          <w:rFonts w:asciiTheme="minorHAnsi" w:hAnsiTheme="minorHAnsi" w:cstheme="minorHAnsi"/>
+          <w:color w:val="000000" w:themeColor="text1"/>
+          <w:sz w:val="20"/>
+          <w:szCs w:val="20"/>
+        </w:rPr>
+        <w:t xml:space="preserve">statistically </w:t>
+      </w:r>
+      <w:r>
+        <w:rPr>
+          <w:rFonts w:asciiTheme="minorHAnsi" w:hAnsiTheme="minorHAnsi" w:cstheme="minorHAnsi"/>
+          <w:color w:val="000000" w:themeColor="text1"/>
+          <w:sz w:val="20"/>
+          <w:szCs w:val="20"/>
+        </w:rPr>
+        <w:t>significant difference</w:t>
+      </w:r>
+      <w:r>
+        <w:rPr>
+          <w:rFonts w:asciiTheme="minorHAnsi" w:hAnsiTheme="minorHAnsi" w:cstheme="minorHAnsi"/>
+          <w:color w:val="000000" w:themeColor="text1"/>
+          <w:sz w:val="20"/>
+          <w:szCs w:val="20"/>
+        </w:rPr>
+        <w:t>?</w:t>
+      </w:r>
+      <w:r>
+        <w:rPr>
+          <w:rFonts w:asciiTheme="minorHAnsi" w:hAnsiTheme="minorHAnsi" w:cstheme="minorHAnsi"/>
+          <w:color w:val="000000" w:themeColor="text1"/>
+          <w:sz w:val="20"/>
+          <w:szCs w:val="20"/>
+        </w:rPr>
+        <w:t xml:space="preserve"> Between which groups </w:t>
+      </w:r>
+      <w:r>
+        <w:rPr>
+          <w:rFonts w:asciiTheme="minorHAnsi" w:hAnsiTheme="minorHAnsi" w:cstheme="minorHAnsi"/>
+          <w:color w:val="000000" w:themeColor="text1"/>
+          <w:sz w:val="20"/>
+          <w:szCs w:val="20"/>
+        </w:rPr>
+        <w:t>would</w:t>
+      </w:r>
+      <w:r>
+        <w:rPr>
+          <w:rFonts w:asciiTheme="minorHAnsi" w:hAnsiTheme="minorHAnsi" w:cstheme="minorHAnsi"/>
+          <w:color w:val="000000" w:themeColor="text1"/>
+          <w:sz w:val="20"/>
+          <w:szCs w:val="20"/>
+        </w:rPr>
+        <w:t xml:space="preserve"> we </w:t>
+      </w:r>
+      <w:r>
+        <w:rPr>
+          <w:rFonts w:asciiTheme="minorHAnsi" w:hAnsiTheme="minorHAnsi" w:cstheme="minorHAnsi"/>
+          <w:color w:val="000000" w:themeColor="text1"/>
+          <w:sz w:val="20"/>
+          <w:szCs w:val="20"/>
+        </w:rPr>
+        <w:t xml:space="preserve">be </w:t>
       </w:r>
       <w:r>
         <w:rPr>
@@ -1937,21 +1999,222 @@
           <w:sz w:val="20"/>
           <w:szCs w:val="20"/>
         </w:rPr>
+        <w:t xml:space="preserve"> to see a </w:t>
+      </w:r>
+      <w:r>
+        <w:rPr>
+          <w:rFonts w:asciiTheme="minorHAnsi" w:hAnsiTheme="minorHAnsi" w:cstheme="minorHAnsi"/>
+          <w:color w:val="000000" w:themeColor="text1"/>
+          <w:sz w:val="20"/>
+          <w:szCs w:val="20"/>
+        </w:rPr>
+        <w:t xml:space="preserve">statistically </w:t>
+      </w:r>
+      <w:r>
+        <w:rPr>
+          <w:rFonts w:asciiTheme="minorHAnsi" w:hAnsiTheme="minorHAnsi" w:cstheme="minorHAnsi"/>
+          <w:color w:val="000000" w:themeColor="text1"/>
+          <w:sz w:val="20"/>
+          <w:szCs w:val="20"/>
+        </w:rPr>
+        <w:t>significant difference in minutes played</w:t>
+      </w:r>
+      <w:r>
+        <w:rPr>
+          <w:rFonts w:asciiTheme="minorHAnsi" w:hAnsiTheme="minorHAnsi" w:cstheme="minorHAnsi"/>
+          <w:color w:val="000000" w:themeColor="text1"/>
+          <w:sz w:val="20"/>
+          <w:szCs w:val="20"/>
+        </w:rPr>
+        <w:t>?</w:t>
+      </w:r>
+      <w:r>
+        <w:rPr>
+          <w:rFonts w:asciiTheme="minorHAnsi" w:hAnsiTheme="minorHAnsi" w:cstheme="minorHAnsi"/>
+          <w:color w:val="000000" w:themeColor="text1"/>
+          <w:sz w:val="20"/>
+          <w:szCs w:val="20"/>
+        </w:rPr>
+        <w:t xml:space="preserve"> Provide evidence.</w:t>
+      </w:r>
+    </w:p>
+    <w:p>
+      <w:pPr>
+        <w:rPr>
+          <w:rFonts w:asciiTheme="minorHAnsi" w:hAnsiTheme="minorHAnsi" w:cstheme="minorHAnsi"/>
+          <w:color w:val="000000" w:themeColor="text1"/>
+          <w:sz w:val="20"/>
+          <w:szCs w:val="20"/>
+        </w:rPr>
+      </w:pPr>
+    </w:p>
+    <w:p>
+      <w:pPr>
+        <w:pStyle w:val="ListParagraph"/>
+        <w:numPr>
+          <w:ilvl w:val="0"/>
+          <w:numId w:val="1"/>
+        </w:numPr>
+        <w:rPr>
+          <w:rFonts w:asciiTheme="minorHAnsi" w:hAnsiTheme="minorHAnsi" w:cstheme="minorHAnsi"/>
+          <w:color w:val="auto"/>
+          <w:sz w:val="20"/>
+          <w:szCs w:val="20"/>
+        </w:rPr>
+      </w:pPr>
+      <w:r>
+        <w:rPr>
+          <w:rFonts w:asciiTheme="minorHAnsi" w:hAnsiTheme="minorHAnsi" w:cstheme="minorHAnsi"/>
+          <w:color w:val="auto"/>
+          <w:sz w:val="20"/>
+          <w:szCs w:val="20"/>
+        </w:rPr>
+        <w:t>Minutes per game is useful, but it is not a perfect measure of player quality. Explain one reason why players selected earlier in the draft might have higher career minutes per game even if draft position does not perfectly measure player ability</w:t>
+      </w:r>
+      <w:r>
+        <w:rPr>
+          <w:rFonts w:asciiTheme="minorHAnsi" w:hAnsiTheme="minorHAnsi" w:cstheme="minorHAnsi"/>
+          <w:color w:val="auto"/>
+          <w:sz w:val="20"/>
+          <w:szCs w:val="20"/>
+        </w:rPr>
+        <w:t>.</w:t>
+      </w:r>
+    </w:p>
+    <w:p>
+      <w:pPr>
+        <w:ind w:left="720"/>
+        <w:rPr>
+          <w:rFonts w:asciiTheme="minorHAnsi" w:hAnsiTheme="minorHAnsi" w:cstheme="minorHAnsi"/>
+          <w:color w:val="FF0000"/>
+          <w:sz w:val="20"/>
+          <w:szCs w:val="20"/>
+        </w:rPr>
+      </w:pPr>
+    </w:p>
+    <w:p>
+      <w:pPr>
+        <w:pStyle w:val="ListParagraph"/>
+        <w:numPr>
+          <w:ilvl w:val="0"/>
+          <w:numId w:val="1"/>
+        </w:numPr>
+        <w:rPr>
+          <w:rFonts w:asciiTheme="minorHAnsi" w:hAnsiTheme="minorHAnsi" w:cstheme="minorHAnsi"/>
+          <w:color w:val="auto"/>
+          <w:sz w:val="20"/>
+          <w:szCs w:val="20"/>
+        </w:rPr>
+      </w:pPr>
+      <w:r>
+        <w:rPr>
+          <w:rFonts w:asciiTheme="minorHAnsi" w:hAnsiTheme="minorHAnsi" w:cstheme="minorHAnsi"/>
+          <w:color w:val="auto"/>
+          <w:sz w:val="20"/>
+          <w:szCs w:val="20"/>
+        </w:rPr>
+        <w:t>The draft-pi</w:t>
+      </w:r>
+      <w:r>
+        <w:rPr>
+          <w:rFonts w:asciiTheme="minorHAnsi" w:hAnsiTheme="minorHAnsi" w:cstheme="minorHAnsi"/>
+          <w:color w:val="auto"/>
+          <w:sz w:val="20"/>
+          <w:szCs w:val="20"/>
+        </w:rPr>
+        <w:t xml:space="preserve">ck groups used in this activity, </w:t>
+      </w:r>
+      <w:r>
+        <w:rPr>
+          <w:rFonts w:asciiTheme="minorHAnsi" w:hAnsiTheme="minorHAnsi" w:cstheme="minorHAnsi"/>
+          <w:color w:val="auto"/>
+          <w:sz w:val="20"/>
+          <w:szCs w:val="20"/>
+        </w:rPr>
+        <w:t>picks 1-10, 11-20, and 21-30</w:t>
+      </w:r>
+      <w:r>
+        <w:rPr>
+          <w:rFonts w:asciiTheme="minorHAnsi" w:hAnsiTheme="minorHAnsi" w:cstheme="minorHAnsi"/>
+          <w:color w:val="auto"/>
+          <w:sz w:val="20"/>
+          <w:szCs w:val="20"/>
+        </w:rPr>
+        <w:t>,</w:t>
+      </w:r>
+      <w:r>
+        <w:rPr>
+          <w:rFonts w:asciiTheme="minorHAnsi" w:hAnsiTheme="minorHAnsi" w:cstheme="minorHAnsi"/>
+          <w:color w:val="auto"/>
+          <w:sz w:val="20"/>
+          <w:szCs w:val="20"/>
+        </w:rPr>
+        <w:t xml:space="preserve"> were chosen by the analyst. While </w:t>
+      </w:r>
+      <w:r>
+        <w:rPr>
+          <w:rFonts w:asciiTheme="minorHAnsi" w:hAnsiTheme="minorHAnsi" w:cstheme="minorHAnsi"/>
+          <w:color w:val="auto"/>
+          <w:sz w:val="20"/>
+          <w:szCs w:val="20"/>
+        </w:rPr>
+        <w:t>this may be</w:t>
+      </w:r>
+      <w:r>
+        <w:rPr>
+          <w:rFonts w:asciiTheme="minorHAnsi" w:hAnsiTheme="minorHAnsi" w:cstheme="minorHAnsi"/>
+          <w:color w:val="auto"/>
+          <w:sz w:val="20"/>
+          <w:szCs w:val="20"/>
+        </w:rPr>
         <w:t xml:space="preserve"> </w:t>
       </w:r>
       <w:r>
         <w:rPr>
           <w:rFonts w:asciiTheme="minorHAnsi" w:hAnsiTheme="minorHAnsi" w:cstheme="minorHAnsi"/>
-          <w:color w:val="000000" w:themeColor="text1"/>
-          <w:sz w:val="20"/>
-          <w:szCs w:val="20"/>
-        </w:rPr>
-        <w:t>to see a significant difference in minutes played. Provide evidence.</w:t>
-      </w:r>
-    </w:p>
-    <w:p/>
+          <w:color w:val="auto"/>
+          <w:sz w:val="20"/>
+          <w:szCs w:val="20"/>
+        </w:rPr>
+        <w:t xml:space="preserve">one reasonable way to divide the first round, but it is not the only option. Propose one different way to group the players or one different variable to analyze if you wanted to better understand the relationship between draft position and NBA career success. Explain why your choice might </w:t>
+      </w:r>
+      <w:r>
+        <w:rPr>
+          <w:rFonts w:asciiTheme="minorHAnsi" w:hAnsiTheme="minorHAnsi" w:cstheme="minorHAnsi"/>
+          <w:color w:val="auto"/>
+          <w:sz w:val="20"/>
+          <w:szCs w:val="20"/>
+        </w:rPr>
+        <w:t xml:space="preserve">change or </w:t>
+      </w:r>
+      <w:r>
+        <w:rPr>
+          <w:rFonts w:asciiTheme="minorHAnsi" w:hAnsiTheme="minorHAnsi" w:cstheme="minorHAnsi"/>
+          <w:color w:val="auto"/>
+          <w:sz w:val="20"/>
+          <w:szCs w:val="20"/>
+        </w:rPr>
+        <w:t>improve the analysis.</w:t>
+      </w:r>
+      <w:r>
+        <w:rPr>
+          <w:rFonts w:asciiTheme="minorHAnsi" w:hAnsiTheme="minorHAnsi" w:cstheme="minorHAnsi"/>
+          <w:color w:val="auto"/>
+          <w:sz w:val="20"/>
+          <w:szCs w:val="20"/>
+        </w:rPr>
+        <w:t xml:space="preserve"> </w:t>
+      </w:r>
+      <w:bookmarkStart w:id="0" w:name="_GoBack"/>
+      <w:bookmarkEnd w:id="0"/>
+    </w:p>
     <w:sectPr>
-      <w:headerReference w:type="default" r:id="rId10"/>
+      <w:headerReference w:type="even" r:id="rId10"/>
+      <w:headerReference w:type="default" r:id="rId11"/>
+      <w:footerReference w:type="even" r:id="rId12"/>
+      <w:footerReference w:type="default" r:id="rId13"/>
+      <w:headerReference w:type="first" r:id="rId14"/>
+      <w:footerReference w:type="first" r:id="rId15"/>
       <w:pgSz w:w="12240" w:h="15840"/>
       <w:pgMar w:top="1440" w:right="1440" w:bottom="1440" w:left="1440" w:header="720" w:footer="720" w:gutter="0"/>
       <w:cols w:space="720"/>
@@ -1962,7 +2225,7 @@
 </file>
 
 <file path=word/endnotes.xml><?xml version="1.0" encoding="utf-8"?>
-<w:endnotes xmlns:wpc="http://schemas.microsoft.com/office/word/2010/wordprocessingCanvas" xmlns:cx="http://schemas.microsoft.com/office/drawing/2014/chartex" xmlns:cx1="http://schemas.microsoft.com/office/drawing/2015/9/8/chartex" xmlns:cx2="http://schemas.microsoft.com/office/drawing/2015/10/21/chartex" xmlns:cx3="http://schemas.microsoft.com/office/drawing/2016/5/9/chartex" xmlns:cx4="http://schemas.microsoft.com/office/drawing/2016/5/10/chartex" xmlns:cx5="http://schemas.microsoft.com/office/drawing/2016/5/11/chartex" xmlns:cx6="http://schemas.microsoft.com/office/drawing/2016/5/12/chartex" xmlns:cx7="http://schemas.microsoft.com/office/drawing/2016/5/13/chartex" xmlns:cx8="http://schemas.microsoft.com/office/drawing/2016/5/14/chartex" xmlns:mc="http://schemas.openxmlformats.org/markup-compatibility/2006" xmlns:aink="http://schemas.microsoft.com/office/drawing/2016/ink" xmlns:am3d="http://schemas.microsoft.com/office/drawing/2017/model3d" xmlns:o="urn:schemas-microsoft-com:office:office" xmlns:oel="http://schemas.microsoft.com/office/2019/extlst" xmlns:r="http://schemas.openxmlformats.org/officeDocument/2006/relationships" xmlns:m="http://schemas.openxmlformats.org/officeDocument/2006/math" xmlns:v="urn:schemas-microsoft-com:vml" xmlns:wp14="http://schemas.microsoft.com/office/word/2010/wordprocessingDrawing" xmlns:wp="http://schemas.openxmlformats.org/drawingml/2006/wordprocessingDrawing" xmlns:w10="urn:schemas-microsoft-com:office:word" xmlns:w="http://schemas.openxmlformats.org/wordprocessingml/2006/main" xmlns:w14="http://schemas.microsoft.com/office/word/2010/wordml" xmlns:w15="http://schemas.microsoft.com/office/word/2012/wordml" xmlns:w16cex="http://schemas.microsoft.com/office/word/2018/wordml/cex" xmlns:w16cid="http://schemas.microsoft.com/office/word/2016/wordml/cid" xmlns:w16="http://schemas.microsoft.com/office/word/2018/wordml" xmlns:w16sdtdh="http://schemas.microsoft.com/office/word/2020/wordml/sdtdatahash" xmlns:w16se="http://schemas.microsoft.com/office/word/2015/wordml/symex" xmlns:wpg="http://schemas.microsoft.com/office/word/2010/wordprocessingGroup" xmlns:wpi="http://schemas.microsoft.com/office/word/2010/wordprocessingInk" xmlns:wne="http://schemas.microsoft.com/office/word/2006/wordml" xmlns:wps="http://schemas.microsoft.com/office/word/2010/wordprocessingShape" mc:Ignorable="w14 w15 w16se w16cid w16 w16cex w16sdtdh wp14">
+<w:endnotes xmlns:wpc="http://schemas.microsoft.com/office/word/2010/wordprocessingCanvas" xmlns:cx="http://schemas.microsoft.com/office/drawing/2014/chartex" xmlns:cx1="http://schemas.microsoft.com/office/drawing/2015/9/8/chartex" xmlns:mc="http://schemas.openxmlformats.org/markup-compatibility/2006" xmlns:o="urn:schemas-microsoft-com:office:office" xmlns:r="http://schemas.openxmlformats.org/officeDocument/2006/relationships" xmlns:m="http://schemas.openxmlformats.org/officeDocument/2006/math" xmlns:v="urn:schemas-microsoft-com:vml" xmlns:wp14="http://schemas.microsoft.com/office/word/2010/wordprocessingDrawing" xmlns:wp="http://schemas.openxmlformats.org/drawingml/2006/wordprocessingDrawing" xmlns:w10="urn:schemas-microsoft-com:office:word" xmlns:w="http://schemas.openxmlformats.org/wordprocessingml/2006/main" xmlns:w14="http://schemas.microsoft.com/office/word/2010/wordml" xmlns:w15="http://schemas.microsoft.com/office/word/2012/wordml" xmlns:w16se="http://schemas.microsoft.com/office/word/2015/wordml/symex" xmlns:wpg="http://schemas.microsoft.com/office/word/2010/wordprocessingGroup" xmlns:wpi="http://schemas.microsoft.com/office/word/2010/wordprocessingInk" xmlns:wne="http://schemas.microsoft.com/office/word/2006/wordml" xmlns:wps="http://schemas.microsoft.com/office/word/2010/wordprocessingShape" mc:Ignorable="w14 w15 w16se wp14">
   <w:endnote w:type="separator" w:id="-1">
     <w:p>
       <w:r>
@@ -1980,8 +2243,38 @@
 </w:endnotes>
 </file>
 
+<file path=word/footer1.xml><?xml version="1.0" encoding="utf-8"?>
+<w:ftr xmlns:wpc="http://schemas.microsoft.com/office/word/2010/wordprocessingCanvas" xmlns:cx="http://schemas.microsoft.com/office/drawing/2014/chartex" xmlns:cx1="http://schemas.microsoft.com/office/drawing/2015/9/8/chartex" xmlns:mc="http://schemas.openxmlformats.org/markup-compatibility/2006" xmlns:o="urn:schemas-microsoft-com:office:office" xmlns:r="http://schemas.openxmlformats.org/officeDocument/2006/relationships" xmlns:m="http://schemas.openxmlformats.org/officeDocument/2006/math" xmlns:v="urn:schemas-microsoft-com:vml" xmlns:wp14="http://schemas.microsoft.com/office/word/2010/wordprocessingDrawing" xmlns:wp="http://schemas.openxmlformats.org/drawingml/2006/wordprocessingDrawing" xmlns:w10="urn:schemas-microsoft-com:office:word" xmlns:w="http://schemas.openxmlformats.org/wordprocessingml/2006/main" xmlns:w14="http://schemas.microsoft.com/office/word/2010/wordml" xmlns:w15="http://schemas.microsoft.com/office/word/2012/wordml" xmlns:w16se="http://schemas.microsoft.com/office/word/2015/wordml/symex" xmlns:wpg="http://schemas.microsoft.com/office/word/2010/wordprocessingGroup" xmlns:wpi="http://schemas.microsoft.com/office/word/2010/wordprocessingInk" xmlns:wne="http://schemas.microsoft.com/office/word/2006/wordml" xmlns:wps="http://schemas.microsoft.com/office/word/2010/wordprocessingShape" mc:Ignorable="w14 w15 w16se wp14">
+  <w:p>
+    <w:pPr>
+      <w:pStyle w:val="Footer"/>
+    </w:pPr>
+  </w:p>
+</w:ftr>
+</file>
+
+<file path=word/footer2.xml><?xml version="1.0" encoding="utf-8"?>
+<w:ftr xmlns:wpc="http://schemas.microsoft.com/office/word/2010/wordprocessingCanvas" xmlns:cx="http://schemas.microsoft.com/office/drawing/2014/chartex" xmlns:cx1="http://schemas.microsoft.com/office/drawing/2015/9/8/chartex" xmlns:mc="http://schemas.openxmlformats.org/markup-compatibility/2006" xmlns:o="urn:schemas-microsoft-com:office:office" xmlns:r="http://schemas.openxmlformats.org/officeDocument/2006/relationships" xmlns:m="http://schemas.openxmlformats.org/officeDocument/2006/math" xmlns:v="urn:schemas-microsoft-com:vml" xmlns:wp14="http://schemas.microsoft.com/office/word/2010/wordprocessingDrawing" xmlns:wp="http://schemas.openxmlformats.org/drawingml/2006/wordprocessingDrawing" xmlns:w10="urn:schemas-microsoft-com:office:word" xmlns:w="http://schemas.openxmlformats.org/wordprocessingml/2006/main" xmlns:w14="http://schemas.microsoft.com/office/word/2010/wordml" xmlns:w15="http://schemas.microsoft.com/office/word/2012/wordml" xmlns:w16se="http://schemas.microsoft.com/office/word/2015/wordml/symex" xmlns:wpg="http://schemas.microsoft.com/office/word/2010/wordprocessingGroup" xmlns:wpi="http://schemas.microsoft.com/office/word/2010/wordprocessingInk" xmlns:wne="http://schemas.microsoft.com/office/word/2006/wordml" xmlns:wps="http://schemas.microsoft.com/office/word/2010/wordprocessingShape" mc:Ignorable="w14 w15 w16se wp14">
+  <w:p>
+    <w:pPr>
+      <w:pStyle w:val="Footer"/>
+    </w:pPr>
+  </w:p>
+</w:ftr>
+</file>
+
+<file path=word/footer3.xml><?xml version="1.0" encoding="utf-8"?>
+<w:ftr xmlns:wpc="http://schemas.microsoft.com/office/word/2010/wordprocessingCanvas" xmlns:cx="http://schemas.microsoft.com/office/drawing/2014/chartex" xmlns:cx1="http://schemas.microsoft.com/office/drawing/2015/9/8/chartex" xmlns:mc="http://schemas.openxmlformats.org/markup-compatibility/2006" xmlns:o="urn:schemas-microsoft-com:office:office" xmlns:r="http://schemas.openxmlformats.org/officeDocument/2006/relationships" xmlns:m="http://schemas.openxmlformats.org/officeDocument/2006/math" xmlns:v="urn:schemas-microsoft-com:vml" xmlns:wp14="http://schemas.microsoft.com/office/word/2010/wordprocessingDrawing" xmlns:wp="http://schemas.openxmlformats.org/drawingml/2006/wordprocessingDrawing" xmlns:w10="urn:schemas-microsoft-com:office:word" xmlns:w="http://schemas.openxmlformats.org/wordprocessingml/2006/main" xmlns:w14="http://schemas.microsoft.com/office/word/2010/wordml" xmlns:w15="http://schemas.microsoft.com/office/word/2012/wordml" xmlns:w16se="http://schemas.microsoft.com/office/word/2015/wordml/symex" xmlns:wpg="http://schemas.microsoft.com/office/word/2010/wordprocessingGroup" xmlns:wpi="http://schemas.microsoft.com/office/word/2010/wordprocessingInk" xmlns:wne="http://schemas.microsoft.com/office/word/2006/wordml" xmlns:wps="http://schemas.microsoft.com/office/word/2010/wordprocessingShape" mc:Ignorable="w14 w15 w16se wp14">
+  <w:p>
+    <w:pPr>
+      <w:pStyle w:val="Footer"/>
+    </w:pPr>
+  </w:p>
+</w:ftr>
+</file>
+
 <file path=word/footnotes.xml><?xml version="1.0" encoding="utf-8"?>
-<w:footnotes xmlns:wpc="http://schemas.microsoft.com/office/word/2010/wordprocessingCanvas" xmlns:cx="http://schemas.microsoft.com/office/drawing/2014/chartex" xmlns:cx1="http://schemas.microsoft.com/office/drawing/2015/9/8/chartex" xmlns:cx2="http://schemas.microsoft.com/office/drawing/2015/10/21/chartex" xmlns:cx3="http://schemas.microsoft.com/office/drawing/2016/5/9/chartex" xmlns:cx4="http://schemas.microsoft.com/office/drawing/2016/5/10/chartex" xmlns:cx5="http://schemas.microsoft.com/office/drawing/2016/5/11/chartex" xmlns:cx6="http://schemas.microsoft.com/office/drawing/2016/5/12/chartex" xmlns:cx7="http://schemas.microsoft.com/office/drawing/2016/5/13/chartex" xmlns:cx8="http://schemas.microsoft.com/office/drawing/2016/5/14/chartex" xmlns:mc="http://schemas.openxmlformats.org/markup-compatibility/2006" xmlns:aink="http://schemas.microsoft.com/office/drawing/2016/ink" xmlns:am3d="http://schemas.microsoft.com/office/drawing/2017/model3d" xmlns:o="urn:schemas-microsoft-com:office:office" xmlns:oel="http://schemas.microsoft.com/office/2019/extlst" xmlns:r="http://schemas.openxmlformats.org/officeDocument/2006/relationships" xmlns:m="http://schemas.openxmlformats.org/officeDocument/2006/math" xmlns:v="urn:schemas-microsoft-com:vml" xmlns:wp14="http://schemas.microsoft.com/office/word/2010/wordprocessingDrawing" xmlns:wp="http://schemas.openxmlformats.org/drawingml/2006/wordprocessingDrawing" xmlns:w10="urn:schemas-microsoft-com:office:word" xmlns:w="http://schemas.openxmlformats.org/wordprocessingml/2006/main" xmlns:w14="http://schemas.microsoft.com/office/word/2010/wordml" xmlns:w15="http://schemas.microsoft.com/office/word/2012/wordml" xmlns:w16cex="http://schemas.microsoft.com/office/word/2018/wordml/cex" xmlns:w16cid="http://schemas.microsoft.com/office/word/2016/wordml/cid" xmlns:w16="http://schemas.microsoft.com/office/word/2018/wordml" xmlns:w16sdtdh="http://schemas.microsoft.com/office/word/2020/wordml/sdtdatahash" xmlns:w16se="http://schemas.microsoft.com/office/word/2015/wordml/symex" xmlns:wpg="http://schemas.microsoft.com/office/word/2010/wordprocessingGroup" xmlns:wpi="http://schemas.microsoft.com/office/word/2010/wordprocessingInk" xmlns:wne="http://schemas.microsoft.com/office/word/2006/wordml" xmlns:wps="http://schemas.microsoft.com/office/word/2010/wordprocessingShape" mc:Ignorable="w14 w15 w16se w16cid w16 w16cex w16sdtdh wp14">
+<w:footnotes xmlns:wpc="http://schemas.microsoft.com/office/word/2010/wordprocessingCanvas" xmlns:cx="http://schemas.microsoft.com/office/drawing/2014/chartex" xmlns:cx1="http://schemas.microsoft.com/office/drawing/2015/9/8/chartex" xmlns:mc="http://schemas.openxmlformats.org/markup-compatibility/2006" xmlns:o="urn:schemas-microsoft-com:office:office" xmlns:r="http://schemas.openxmlformats.org/officeDocument/2006/relationships" xmlns:m="http://schemas.openxmlformats.org/officeDocument/2006/math" xmlns:v="urn:schemas-microsoft-com:vml" xmlns:wp14="http://schemas.microsoft.com/office/word/2010/wordprocessingDrawing" xmlns:wp="http://schemas.openxmlformats.org/drawingml/2006/wordprocessingDrawing" xmlns:w10="urn:schemas-microsoft-com:office:word" xmlns:w="http://schemas.openxmlformats.org/wordprocessingml/2006/main" xmlns:w14="http://schemas.microsoft.com/office/word/2010/wordml" xmlns:w15="http://schemas.microsoft.com/office/word/2012/wordml" xmlns:w16se="http://schemas.microsoft.com/office/word/2015/wordml/symex" xmlns:wpg="http://schemas.microsoft.com/office/word/2010/wordprocessingGroup" xmlns:wpi="http://schemas.microsoft.com/office/word/2010/wordprocessingInk" xmlns:wne="http://schemas.microsoft.com/office/word/2006/wordml" xmlns:wps="http://schemas.microsoft.com/office/word/2010/wordprocessingShape" mc:Ignorable="w14 w15 w16se wp14">
   <w:footnote w:type="separator" w:id="-1">
     <w:p>
       <w:r>
@@ -2000,7 +2293,17 @@
 </file>
 
 <file path=word/header1.xml><?xml version="1.0" encoding="utf-8"?>
-<w:hdr xmlns:wpc="http://schemas.microsoft.com/office/word/2010/wordprocessingCanvas" xmlns:cx="http://schemas.microsoft.com/office/drawing/2014/chartex" xmlns:cx1="http://schemas.microsoft.com/office/drawing/2015/9/8/chartex" xmlns:cx2="http://schemas.microsoft.com/office/drawing/2015/10/21/chartex" xmlns:cx3="http://schemas.microsoft.com/office/drawing/2016/5/9/chartex" xmlns:cx4="http://schemas.microsoft.com/office/drawing/2016/5/10/chartex" xmlns:cx5="http://schemas.microsoft.com/office/drawing/2016/5/11/chartex" xmlns:cx6="http://schemas.microsoft.com/office/drawing/2016/5/12/chartex" xmlns:cx7="http://schemas.microsoft.com/office/drawing/2016/5/13/chartex" xmlns:cx8="http://schemas.microsoft.com/office/drawing/2016/5/14/chartex" xmlns:mc="http://schemas.openxmlformats.org/markup-compatibility/2006" xmlns:aink="http://schemas.microsoft.com/office/drawing/2016/ink" xmlns:am3d="http://schemas.microsoft.com/office/drawing/2017/model3d" xmlns:o="urn:schemas-microsoft-com:office:office" xmlns:oel="http://schemas.microsoft.com/office/2019/extlst" xmlns:r="http://schemas.openxmlformats.org/officeDocument/2006/relationships" xmlns:m="http://schemas.openxmlformats.org/officeDocument/2006/math" xmlns:v="urn:schemas-microsoft-com:vml" xmlns:wp14="http://schemas.microsoft.com/office/word/2010/wordprocessingDrawing" xmlns:wp="http://schemas.openxmlformats.org/drawingml/2006/wordprocessingDrawing" xmlns:w10="urn:schemas-microsoft-com:office:word" xmlns:w="http://schemas.openxmlformats.org/wordprocessingml/2006/main" xmlns:w14="http://schemas.microsoft.com/office/word/2010/wordml" xmlns:w15="http://schemas.microsoft.com/office/word/2012/wordml" xmlns:w16cex="http://schemas.microsoft.com/office/word/2018/wordml/cex" xmlns:w16cid="http://schemas.microsoft.com/office/word/2016/wordml/cid" xmlns:w16="http://schemas.microsoft.com/office/word/2018/wordml" xmlns:w16sdtdh="http://schemas.microsoft.com/office/word/2020/wordml/sdtdatahash" xmlns:w16se="http://schemas.microsoft.com/office/word/2015/wordml/symex" xmlns:wpg="http://schemas.microsoft.com/office/word/2010/wordprocessingGroup" xmlns:wpi="http://schemas.microsoft.com/office/word/2010/wordprocessingInk" xmlns:wne="http://schemas.microsoft.com/office/word/2006/wordml" xmlns:wps="http://schemas.microsoft.com/office/word/2010/wordprocessingShape" mc:Ignorable="w14 w15 w16se w16cid w16 w16cex w16sdtdh wp14">
+<w:hdr xmlns:wpc="http://schemas.microsoft.com/office/word/2010/wordprocessingCanvas" xmlns:cx="http://schemas.microsoft.com/office/drawing/2014/chartex" xmlns:cx1="http://schemas.microsoft.com/office/drawing/2015/9/8/chartex" xmlns:mc="http://schemas.openxmlformats.org/markup-compatibility/2006" xmlns:o="urn:schemas-microsoft-com:office:office" xmlns:r="http://schemas.openxmlformats.org/officeDocument/2006/relationships" xmlns:m="http://schemas.openxmlformats.org/officeDocument/2006/math" xmlns:v="urn:schemas-microsoft-com:vml" xmlns:wp14="http://schemas.microsoft.com/office/word/2010/wordprocessingDrawing" xmlns:wp="http://schemas.openxmlformats.org/drawingml/2006/wordprocessingDrawing" xmlns:w10="urn:schemas-microsoft-com:office:word" xmlns:w="http://schemas.openxmlformats.org/wordprocessingml/2006/main" xmlns:w14="http://schemas.microsoft.com/office/word/2010/wordml" xmlns:w15="http://schemas.microsoft.com/office/word/2012/wordml" xmlns:w16se="http://schemas.microsoft.com/office/word/2015/wordml/symex" xmlns:wpg="http://schemas.microsoft.com/office/word/2010/wordprocessingGroup" xmlns:wpi="http://schemas.microsoft.com/office/word/2010/wordprocessingInk" xmlns:wne="http://schemas.microsoft.com/office/word/2006/wordml" xmlns:wps="http://schemas.microsoft.com/office/word/2010/wordprocessingShape" mc:Ignorable="w14 w15 w16se wp14">
+  <w:p>
+    <w:pPr>
+      <w:pStyle w:val="Header"/>
+    </w:pPr>
+  </w:p>
+</w:hdr>
+</file>
+
+<file path=word/header2.xml><?xml version="1.0" encoding="utf-8"?>
+<w:hdr xmlns:wpc="http://schemas.microsoft.com/office/word/2010/wordprocessingCanvas" xmlns:cx="http://schemas.microsoft.com/office/drawing/2014/chartex" xmlns:cx1="http://schemas.microsoft.com/office/drawing/2015/9/8/chartex" xmlns:mc="http://schemas.openxmlformats.org/markup-compatibility/2006" xmlns:o="urn:schemas-microsoft-com:office:office" xmlns:r="http://schemas.openxmlformats.org/officeDocument/2006/relationships" xmlns:m="http://schemas.openxmlformats.org/officeDocument/2006/math" xmlns:v="urn:schemas-microsoft-com:vml" xmlns:wp14="http://schemas.microsoft.com/office/word/2010/wordprocessingDrawing" xmlns:wp="http://schemas.openxmlformats.org/drawingml/2006/wordprocessingDrawing" xmlns:w10="urn:schemas-microsoft-com:office:word" xmlns:w="http://schemas.openxmlformats.org/wordprocessingml/2006/main" xmlns:w14="http://schemas.microsoft.com/office/word/2010/wordml" xmlns:w15="http://schemas.microsoft.com/office/word/2012/wordml" xmlns:w16se="http://schemas.microsoft.com/office/word/2015/wordml/symex" xmlns:wpg="http://schemas.microsoft.com/office/word/2010/wordprocessingGroup" xmlns:wpi="http://schemas.microsoft.com/office/word/2010/wordprocessingInk" xmlns:wne="http://schemas.microsoft.com/office/word/2006/wordml" xmlns:wps="http://schemas.microsoft.com/office/word/2010/wordprocessingShape" mc:Ignorable="w14 w15 w16se wp14">
   <w:p>
     <w:pPr>
       <w:pStyle w:val="Header"/>
@@ -2028,12 +2331,135 @@
 </w:hdr>
 </file>
 
+<file path=word/header3.xml><?xml version="1.0" encoding="utf-8"?>
+<w:hdr xmlns:wpc="http://schemas.microsoft.com/office/word/2010/wordprocessingCanvas" xmlns:cx="http://schemas.microsoft.com/office/drawing/2014/chartex" xmlns:cx1="http://schemas.microsoft.com/office/drawing/2015/9/8/chartex" xmlns:mc="http://schemas.openxmlformats.org/markup-compatibility/2006" xmlns:o="urn:schemas-microsoft-com:office:office" xmlns:r="http://schemas.openxmlformats.org/officeDocument/2006/relationships" xmlns:m="http://schemas.openxmlformats.org/officeDocument/2006/math" xmlns:v="urn:schemas-microsoft-com:vml" xmlns:wp14="http://schemas.microsoft.com/office/word/2010/wordprocessingDrawing" xmlns:wp="http://schemas.openxmlformats.org/drawingml/2006/wordprocessingDrawing" xmlns:w10="urn:schemas-microsoft-com:office:word" xmlns:w="http://schemas.openxmlformats.org/wordprocessingml/2006/main" xmlns:w14="http://schemas.microsoft.com/office/word/2010/wordml" xmlns:w15="http://schemas.microsoft.com/office/word/2012/wordml" xmlns:w16se="http://schemas.microsoft.com/office/word/2015/wordml/symex" xmlns:wpg="http://schemas.microsoft.com/office/word/2010/wordprocessingGroup" xmlns:wpi="http://schemas.microsoft.com/office/word/2010/wordprocessingInk" xmlns:wne="http://schemas.microsoft.com/office/word/2006/wordml" xmlns:wps="http://schemas.microsoft.com/office/word/2010/wordprocessingShape" mc:Ignorable="w14 w15 w16se wp14">
+  <w:p>
+    <w:pPr>
+      <w:pStyle w:val="Header"/>
+    </w:pPr>
+  </w:p>
+</w:hdr>
+</file>
+
 <file path=word/numbering.xml><?xml version="1.0" encoding="utf-8"?>
-<w:numbering xmlns:wpc="http://schemas.microsoft.com/office/word/2010/wordprocessingCanvas" xmlns:cx="http://schemas.microsoft.com/office/drawing/2014/chartex" xmlns:cx1="http://schemas.microsoft.com/office/drawing/2015/9/8/chartex" xmlns:cx2="http://schemas.microsoft.com/office/drawing/2015/10/21/chartex" xmlns:cx3="http://schemas.microsoft.com/office/drawing/2016/5/9/chartex" xmlns:cx4="http://schemas.microsoft.com/office/drawing/2016/5/10/chartex" xmlns:cx5="http://schemas.microsoft.com/office/drawing/2016/5/11/chartex" xmlns:cx6="http://schemas.microsoft.com/office/drawing/2016/5/12/chartex" xmlns:cx7="http://schemas.microsoft.com/office/drawing/2016/5/13/chartex" xmlns:cx8="http://schemas.microsoft.com/office/drawing/2016/5/14/chartex" xmlns:mc="http://schemas.openxmlformats.org/markup-compatibility/2006" xmlns:aink="http://schemas.microsoft.com/office/drawing/2016/ink" xmlns:am3d="http://schemas.microsoft.com/office/drawing/2017/model3d" xmlns:o="urn:schemas-microsoft-com:office:office" xmlns:oel="http://schemas.microsoft.com/office/2019/extlst" xmlns:r="http://schemas.openxmlformats.org/officeDocument/2006/relationships" xmlns:m="http://schemas.openxmlformats.org/officeDocument/2006/math" xmlns:v="urn:schemas-microsoft-com:vml" xmlns:wp14="http://schemas.microsoft.com/office/word/2010/wordprocessingDrawing" xmlns:wp="http://schemas.openxmlformats.org/drawingml/2006/wordprocessingDrawing" xmlns:w10="urn:schemas-microsoft-com:office:word" xmlns:w="http://schemas.openxmlformats.org/wordprocessingml/2006/main" xmlns:w14="http://schemas.microsoft.com/office/word/2010/wordml" xmlns:w15="http://schemas.microsoft.com/office/word/2012/wordml" xmlns:w16cex="http://schemas.microsoft.com/office/word/2018/wordml/cex" xmlns:w16cid="http://schemas.microsoft.com/office/word/2016/wordml/cid" xmlns:w16="http://schemas.microsoft.com/office/word/2018/wordml" xmlns:w16sdtdh="http://schemas.microsoft.com/office/word/2020/wordml/sdtdatahash" xmlns:w16se="http://schemas.microsoft.com/office/word/2015/wordml/symex" xmlns:wpg="http://schemas.microsoft.com/office/word/2010/wordprocessingGroup" xmlns:wpi="http://schemas.microsoft.com/office/word/2010/wordprocessingInk" xmlns:wne="http://schemas.microsoft.com/office/word/2006/wordml" xmlns:wps="http://schemas.microsoft.com/office/word/2010/wordprocessingShape" mc:Ignorable="w14 w15 w16se w16cid w16 w16cex w16sdtdh wp14">
+<w:numbering xmlns:wpc="http://schemas.microsoft.com/office/word/2010/wordprocessingCanvas" xmlns:cx="http://schemas.microsoft.com/office/drawing/2014/chartex" xmlns:cx1="http://schemas.microsoft.com/office/drawing/2015/9/8/chartex" xmlns:mc="http://schemas.openxmlformats.org/markup-compatibility/2006" xmlns:o="urn:schemas-microsoft-com:office:office" xmlns:r="http://schemas.openxmlformats.org/officeDocument/2006/relationships" xmlns:m="http://schemas.openxmlformats.org/officeDocument/2006/math" xmlns:v="urn:schemas-microsoft-com:vml" xmlns:wp14="http://schemas.microsoft.com/office/word/2010/wordprocessingDrawing" xmlns:wp="http://schemas.openxmlformats.org/drawingml/2006/wordprocessingDrawing" xmlns:w10="urn:schemas-microsoft-com:office:word" xmlns:w="http://schemas.openxmlformats.org/wordprocessingml/2006/main" xmlns:w14="http://schemas.microsoft.com/office/word/2010/wordml" xmlns:w15="http://schemas.microsoft.com/office/word/2012/wordml" xmlns:w16se="http://schemas.microsoft.com/office/word/2015/wordml/symex" xmlns:wpg="http://schemas.microsoft.com/office/word/2010/wordprocessingGroup" xmlns:wpi="http://schemas.microsoft.com/office/word/2010/wordprocessingInk" xmlns:wne="http://schemas.microsoft.com/office/word/2006/wordml" xmlns:wps="http://schemas.microsoft.com/office/word/2010/wordprocessingShape" mc:Ignorable="w14 w15 w16se wp14">
   <w:abstractNum w:abstractNumId="0" w15:restartNumberingAfterBreak="0">
+    <w:nsid w:val="39F063B9"/>
+    <w:multiLevelType w:val="hybridMultilevel"/>
+    <w:tmpl w:val="8A7E797E"/>
+    <w:lvl w:ilvl="0" w:tplc="2A64C246">
+      <w:start w:val="2"/>
+      <w:numFmt w:val="bullet"/>
+      <w:lvlText w:val="-"/>
+      <w:lvlJc w:val="left"/>
+      <w:pPr>
+        <w:ind w:left="1080" w:hanging="360"/>
+      </w:pPr>
+      <w:rPr>
+        <w:rFonts w:ascii="Calibri" w:eastAsiaTheme="minorHAnsi" w:hAnsi="Calibri" w:cs="Calibri" w:hint="default"/>
+      </w:rPr>
+    </w:lvl>
+    <w:lvl w:ilvl="1" w:tplc="04090003" w:tentative="1">
+      <w:start w:val="1"/>
+      <w:numFmt w:val="bullet"/>
+      <w:lvlText w:val="o"/>
+      <w:lvlJc w:val="left"/>
+      <w:pPr>
+        <w:ind w:left="1800" w:hanging="360"/>
+      </w:pPr>
+      <w:rPr>
+        <w:rFonts w:ascii="Courier New" w:hAnsi="Courier New" w:cs="Courier New" w:hint="default"/>
+      </w:rPr>
+    </w:lvl>
+    <w:lvl w:ilvl="2" w:tplc="04090005" w:tentative="1">
+      <w:start w:val="1"/>
+      <w:numFmt w:val="bullet"/>
+      <w:lvlText w:val=""/>
+      <w:lvlJc w:val="left"/>
+      <w:pPr>
+        <w:ind w:left="2520" w:hanging="360"/>
+      </w:pPr>
+      <w:rPr>
+        <w:rFonts w:ascii="Wingdings" w:hAnsi="Wingdings" w:hint="default"/>
+      </w:rPr>
+    </w:lvl>
+    <w:lvl w:ilvl="3" w:tplc="04090001" w:tentative="1">
+      <w:start w:val="1"/>
+      <w:numFmt w:val="bullet"/>
+      <w:lvlText w:val=""/>
+      <w:lvlJc w:val="left"/>
+      <w:pPr>
+        <w:ind w:left="3240" w:hanging="360"/>
+      </w:pPr>
+      <w:rPr>
+        <w:rFonts w:ascii="Symbol" w:hAnsi="Symbol" w:hint="default"/>
+      </w:rPr>
+    </w:lvl>
+    <w:lvl w:ilvl="4" w:tplc="04090003" w:tentative="1">
+      <w:start w:val="1"/>
+      <w:numFmt w:val="bullet"/>
+      <w:lvlText w:val="o"/>
+      <w:lvlJc w:val="left"/>
+      <w:pPr>
+        <w:ind w:left="3960" w:hanging="360"/>
+      </w:pPr>
+      <w:rPr>
+        <w:rFonts w:ascii="Courier New" w:hAnsi="Courier New" w:cs="Courier New" w:hint="default"/>
+      </w:rPr>
+    </w:lvl>
+    <w:lvl w:ilvl="5" w:tplc="04090005" w:tentative="1">
+      <w:start w:val="1"/>
+      <w:numFmt w:val="bullet"/>
+      <w:lvlText w:val=""/>
+      <w:lvlJc w:val="left"/>
+      <w:pPr>
+        <w:ind w:left="4680" w:hanging="360"/>
+      </w:pPr>
+      <w:rPr>
+        <w:rFonts w:ascii="Wingdings" w:hAnsi="Wingdings" w:hint="default"/>
+      </w:rPr>
+    </w:lvl>
+    <w:lvl w:ilvl="6" w:tplc="04090001" w:tentative="1">
+      <w:start w:val="1"/>
+      <w:numFmt w:val="bullet"/>
+      <w:lvlText w:val=""/>
+      <w:lvlJc w:val="left"/>
+      <w:pPr>
+        <w:ind w:left="5400" w:hanging="360"/>
+      </w:pPr>
+      <w:rPr>
+        <w:rFonts w:ascii="Symbol" w:hAnsi="Symbol" w:hint="default"/>
+      </w:rPr>
+    </w:lvl>
+    <w:lvl w:ilvl="7" w:tplc="04090003" w:tentative="1">
+      <w:start w:val="1"/>
+      <w:numFmt w:val="bullet"/>
+      <w:lvlText w:val="o"/>
+      <w:lvlJc w:val="left"/>
+      <w:pPr>
+        <w:ind w:left="6120" w:hanging="360"/>
+      </w:pPr>
+      <w:rPr>
+        <w:rFonts w:ascii="Courier New" w:hAnsi="Courier New" w:cs="Courier New" w:hint="default"/>
+      </w:rPr>
+    </w:lvl>
+    <w:lvl w:ilvl="8" w:tplc="04090005" w:tentative="1">
+      <w:start w:val="1"/>
+      <w:numFmt w:val="bullet"/>
+      <w:lvlText w:val=""/>
+      <w:lvlJc w:val="left"/>
+      <w:pPr>
+        <w:ind w:left="6840" w:hanging="360"/>
+      </w:pPr>
+      <w:rPr>
+        <w:rFonts w:ascii="Wingdings" w:hAnsi="Wingdings" w:hint="default"/>
+      </w:rPr>
+    </w:lvl>
+  </w:abstractNum>
+  <w:abstractNum w:abstractNumId="1" w15:restartNumberingAfterBreak="0">
     <w:nsid w:val="76AB4CC7"/>
     <w:multiLevelType w:val="hybridMultilevel"/>
-    <w:tmpl w:val="B374DC86"/>
+    <w:tmpl w:val="0B1EC3C2"/>
     <w:lvl w:ilvl="0" w:tplc="7B76CC64">
       <w:start w:val="1"/>
       <w:numFmt w:val="decimal"/>
@@ -2120,14 +2546,17 @@
       </w:pPr>
     </w:lvl>
   </w:abstractNum>
-  <w:num w:numId="1" w16cid:durableId="2018922024">
+  <w:num w:numId="1">
+    <w:abstractNumId w:val="1"/>
+  </w:num>
+  <w:num w:numId="2">
     <w:abstractNumId w:val="0"/>
   </w:num>
 </w:numbering>
 </file>
 
 <file path=word/styles.xml><?xml version="1.0" encoding="utf-8"?>
-<w:styles xmlns:mc="http://schemas.openxmlformats.org/markup-compatibility/2006" xmlns:r="http://schemas.openxmlformats.org/officeDocument/2006/relationships" xmlns:w="http://schemas.openxmlformats.org/wordprocessingml/2006/main" xmlns:w14="http://schemas.microsoft.com/office/word/2010/wordml" xmlns:w15="http://schemas.microsoft.com/office/word/2012/wordml" xmlns:w16cex="http://schemas.microsoft.com/office/word/2018/wordml/cex" xmlns:w16cid="http://schemas.microsoft.com/office/word/2016/wordml/cid" xmlns:w16="http://schemas.microsoft.com/office/word/2018/wordml" xmlns:w16sdtdh="http://schemas.microsoft.com/office/word/2020/wordml/sdtdatahash" xmlns:w16se="http://schemas.microsoft.com/office/word/2015/wordml/symex" mc:Ignorable="w14 w15 w16se w16cid w16 w16cex w16sdtdh">
+<w:styles xmlns:mc="http://schemas.openxmlformats.org/markup-compatibility/2006" xmlns:r="http://schemas.openxmlformats.org/officeDocument/2006/relationships" xmlns:w="http://schemas.openxmlformats.org/wordprocessingml/2006/main" xmlns:w14="http://schemas.microsoft.com/office/word/2010/wordml" xmlns:w15="http://schemas.microsoft.com/office/word/2012/wordml" xmlns:w16se="http://schemas.microsoft.com/office/word/2015/wordml/symex" mc:Ignorable="w14 w15 w16se">
   <w:docDefaults>
     <w:rPrDefault>
       <w:rPr>
@@ -2140,7 +2569,7 @@
     </w:rPrDefault>
     <w:pPrDefault/>
   </w:docDefaults>
-  <w:latentStyles w:defLockedState="0" w:defUIPriority="99" w:defSemiHidden="0" w:defUnhideWhenUsed="0" w:defQFormat="0" w:count="376">
+  <w:latentStyles w:defLockedState="0" w:defUIPriority="99" w:defSemiHidden="0" w:defUnhideWhenUsed="0" w:defQFormat="0" w:count="371">
     <w:lsdException w:name="Normal" w:uiPriority="0" w:qFormat="1"/>
     <w:lsdException w:name="heading 1" w:uiPriority="9" w:qFormat="1"/>
     <w:lsdException w:name="heading 2" w:semiHidden="1" w:uiPriority="9" w:unhideWhenUsed="1" w:qFormat="1"/>
@@ -2512,21 +2941,14 @@
     <w:lsdException w:name="List Table 5 Dark Accent 6" w:uiPriority="50"/>
     <w:lsdException w:name="List Table 6 Colorful Accent 6" w:uiPriority="51"/>
     <w:lsdException w:name="List Table 7 Colorful Accent 6" w:uiPriority="52"/>
-    <w:lsdException w:name="Mention" w:semiHidden="1" w:unhideWhenUsed="1"/>
-    <w:lsdException w:name="Smart Hyperlink" w:semiHidden="1" w:unhideWhenUsed="1"/>
-    <w:lsdException w:name="Hashtag" w:semiHidden="1" w:unhideWhenUsed="1"/>
-    <w:lsdException w:name="Unresolved Mention" w:semiHidden="1" w:unhideWhenUsed="1"/>
-    <w:lsdException w:name="Smart Link" w:semiHidden="1" w:unhideWhenUsed="1"/>
   </w:latentStyles>
   <w:style w:type="paragraph" w:default="1" w:styleId="Normal">
     <w:name w:val="Normal"/>
     <w:qFormat/>
-    <w:rsid w:val="00E71B96"/>
   </w:style>
   <w:style w:type="character" w:default="1" w:styleId="DefaultParagraphFont">
     <w:name w:val="Default Paragraph Font"/>
     <w:uiPriority w:val="1"/>
-    <w:semiHidden/>
     <w:unhideWhenUsed/>
   </w:style>
   <w:style w:type="table" w:default="1" w:styleId="TableNormal">
@@ -2556,7 +2978,7 @@
     <w:link w:val="HeaderChar"/>
     <w:uiPriority w:val="99"/>
     <w:unhideWhenUsed/>
-    <w:rsid w:val="00312833"/>
+    <w:rsid w:val="00AA1290"/>
     <w:pPr>
       <w:tabs>
         <w:tab w:val="center" w:pos="4680"/>
@@ -2569,24 +2991,55 @@
     <w:basedOn w:val="DefaultParagraphFont"/>
     <w:link w:val="Header"/>
     <w:uiPriority w:val="99"/>
-    <w:rsid w:val="00312833"/>
+    <w:rsid w:val="00AA1290"/>
+  </w:style>
+  <w:style w:type="paragraph" w:styleId="Footer">
+    <w:name w:val="footer"/>
+    <w:basedOn w:val="Normal"/>
+    <w:link w:val="FooterChar"/>
+    <w:uiPriority w:val="99"/>
+    <w:unhideWhenUsed/>
+    <w:rsid w:val="00AA1290"/>
+    <w:pPr>
+      <w:tabs>
+        <w:tab w:val="center" w:pos="4680"/>
+        <w:tab w:val="right" w:pos="9360"/>
+      </w:tabs>
+    </w:pPr>
+  </w:style>
+  <w:style w:type="character" w:customStyle="1" w:styleId="FooterChar">
+    <w:name w:val="Footer Char"/>
+    <w:basedOn w:val="DefaultParagraphFont"/>
+    <w:link w:val="Footer"/>
+    <w:uiPriority w:val="99"/>
+    <w:rsid w:val="00AA1290"/>
   </w:style>
   <w:style w:type="paragraph" w:styleId="ListParagraph">
     <w:name w:val="List Paragraph"/>
     <w:basedOn w:val="Normal"/>
     <w:uiPriority w:val="34"/>
     <w:qFormat/>
-    <w:rsid w:val="00312833"/>
+    <w:rsid w:val="004E298C"/>
     <w:pPr>
       <w:ind w:left="720"/>
       <w:contextualSpacing/>
     </w:pPr>
   </w:style>
+  <w:style w:type="character" w:styleId="PlaceholderText">
+    <w:name w:val="Placeholder Text"/>
+    <w:basedOn w:val="DefaultParagraphFont"/>
+    <w:uiPriority w:val="99"/>
+    <w:semiHidden/>
+    <w:rsid w:val="004E298C"/>
+    <w:rPr>
+      <w:color w:val="808080"/>
+    </w:rPr>
+  </w:style>
   <w:style w:type="table" w:styleId="TableGrid">
     <w:name w:val="Table Grid"/>
     <w:basedOn w:val="TableNormal"/>
     <w:uiPriority w:val="39"/>
-    <w:rsid w:val="00312833"/>
+    <w:rsid w:val="00EA5D0E"/>
     <w:tblPr>
       <w:tblBorders>
         <w:top w:val="single" w:sz="4" w:space="0" w:color="auto"/>
@@ -2604,7 +3057,7 @@
     <w:link w:val="HTMLPreformattedChar"/>
     <w:uiPriority w:val="99"/>
     <w:unhideWhenUsed/>
-    <w:rsid w:val="00312833"/>
+    <w:rsid w:val="007D6866"/>
     <w:pPr>
       <w:tabs>
         <w:tab w:val="left" w:pos="916"/>
@@ -2637,34 +3090,13 @@
     <w:basedOn w:val="DefaultParagraphFont"/>
     <w:link w:val="HTMLPreformatted"/>
     <w:uiPriority w:val="99"/>
-    <w:rsid w:val="00312833"/>
+    <w:rsid w:val="007D6866"/>
     <w:rPr>
       <w:rFonts w:ascii="Courier New" w:eastAsia="Times New Roman" w:hAnsi="Courier New" w:cs="Courier New"/>
       <w:color w:val="auto"/>
       <w:sz w:val="20"/>
       <w:szCs w:val="20"/>
     </w:rPr>
-  </w:style>
-  <w:style w:type="paragraph" w:styleId="Footer">
-    <w:name w:val="footer"/>
-    <w:basedOn w:val="Normal"/>
-    <w:link w:val="FooterChar"/>
-    <w:uiPriority w:val="99"/>
-    <w:unhideWhenUsed/>
-    <w:rsid w:val="00312833"/>
-    <w:pPr>
-      <w:tabs>
-        <w:tab w:val="center" w:pos="4680"/>
-        <w:tab w:val="right" w:pos="9360"/>
-      </w:tabs>
-    </w:pPr>
-  </w:style>
-  <w:style w:type="character" w:customStyle="1" w:styleId="FooterChar">
-    <w:name w:val="Footer Char"/>
-    <w:basedOn w:val="DefaultParagraphFont"/>
-    <w:link w:val="Footer"/>
-    <w:uiPriority w:val="99"/>
-    <w:rsid w:val="00312833"/>
   </w:style>
 </w:styles>
 </file>

</xml_diff>